<commit_message>
style: use Aptos and PingFang in project guide
Apply the requested Latin and Traditional Chinese font pairing while keeping the safety and configuration matrices intact across fallback renderers.
</commit_message>
<xml_diff>
--- a/docs/Agent-Rina-Project-Guide.zh-TW.docx
+++ b/docs/Agent-Rina-Project-Guide.zh-TW.docx
@@ -9,7 +9,7 @@
       </w:pPr>
       <w:r>
         <w:rPr>
-          <w:rFonts w:ascii="Calibri" w:hAnsi="Calibri" w:eastAsia="Arial Unicode MS"/>
+          <w:rFonts w:ascii="Aptos" w:hAnsi="Aptos" w:eastAsia="PingFang TC" w:cs="Aptos"/>
           <w:b/>
           <w:color w:val="B48116"/>
           <w:sz w:val="22"/>
@@ -24,7 +24,7 @@
       </w:pPr>
       <w:r>
         <w:rPr>
-          <w:rFonts w:ascii="Calibri" w:hAnsi="Calibri" w:eastAsia="Arial Unicode MS"/>
+          <w:rFonts w:ascii="Aptos" w:hAnsi="Aptos" w:eastAsia="PingFang TC" w:cs="Aptos"/>
           <w:b/>
           <w:color w:val="183A61"/>
           <w:sz w:val="68"/>
@@ -39,7 +39,7 @@
       </w:pPr>
       <w:r>
         <w:rPr>
-          <w:rFonts w:ascii="Arial Unicode MS" w:hAnsi="Arial Unicode MS" w:eastAsia="Arial Unicode MS"/>
+          <w:rFonts w:ascii="Aptos" w:hAnsi="Aptos" w:eastAsia="PingFang TC" w:cs="Aptos"/>
           <w:color w:val="1F4D78"/>
           <w:sz w:val="34"/>
         </w:rPr>
@@ -54,7 +54,7 @@
       </w:pPr>
       <w:r>
         <w:rPr>
-          <w:rFonts w:ascii="Arial Unicode MS" w:hAnsi="Arial Unicode MS" w:eastAsia="Arial Unicode MS"/>
+          <w:rFonts w:ascii="Aptos" w:hAnsi="Aptos" w:eastAsia="PingFang TC" w:cs="Aptos"/>
           <w:color w:val="5E6E79"/>
           <w:sz w:val="25"/>
         </w:rPr>
@@ -70,7 +70,7 @@
       </w:pPr>
       <w:r>
         <w:rPr>
-          <w:rFonts w:ascii="Calibri" w:hAnsi="Calibri" w:eastAsia="Arial Unicode MS"/>
+          <w:rFonts w:ascii="Aptos" w:hAnsi="Aptos" w:eastAsia="PingFang TC" w:cs="Aptos"/>
           <w:b/>
           <w:color w:val="183A61"/>
           <w:sz w:val="26"/>
@@ -85,7 +85,7 @@
       </w:pPr>
       <w:r>
         <w:rPr>
-          <w:rFonts w:ascii="Calibri" w:hAnsi="Calibri" w:eastAsia="Arial Unicode MS"/>
+          <w:rFonts w:ascii="Aptos" w:hAnsi="Aptos" w:eastAsia="PingFang TC" w:cs="Aptos"/>
           <w:b/>
           <w:color w:val="5E6E79"/>
           <w:sz w:val="21"/>
@@ -99,7 +99,7 @@
       </w:pPr>
       <w:r>
         <w:rPr>
-          <w:rFonts w:ascii="Calibri" w:hAnsi="Calibri" w:eastAsia="Arial Unicode MS"/>
+          <w:rFonts w:ascii="Aptos" w:hAnsi="Aptos" w:eastAsia="PingFang TC" w:cs="Aptos"/>
           <w:color w:val="5E6E79"/>
           <w:sz w:val="19"/>
         </w:rPr>
@@ -125,7 +125,7 @@
       </w:pPr>
       <w:r>
         <w:rPr>
-          <w:rFonts w:ascii="Arial Unicode MS" w:hAnsi="Arial Unicode MS" w:eastAsia="Arial Unicode MS"/>
+          <w:rFonts w:ascii="Aptos" w:hAnsi="Aptos" w:eastAsia="PingFang TC" w:cs="Aptos"/>
           <w:color w:val="263238"/>
         </w:rPr>
         <w:t>這份文件是面向新加入的工程師與專案利害關係人的技術導覽。它不是逐行 API 文件，而是說明 Agent Rina 的定位、主要元件、訊息如何流動、外部工具在哪裡被呼叫，以及目前有哪些可見的限制。</w:t>
@@ -143,7 +143,7 @@
       </w:pPr>
       <w:r>
         <w:rPr>
-          <w:rFonts w:ascii="Arial Unicode MS" w:hAnsi="Arial Unicode MS" w:eastAsia="Arial Unicode MS"/>
+          <w:rFonts w:ascii="Aptos" w:hAnsi="Aptos" w:eastAsia="PingFang TC" w:cs="Aptos"/>
           <w:b/>
           <w:color w:val="183A61"/>
         </w:rPr>
@@ -151,7 +151,7 @@
       </w:r>
       <w:r>
         <w:rPr>
-          <w:rFonts w:ascii="Arial Unicode MS" w:hAnsi="Arial Unicode MS" w:eastAsia="Arial Unicode MS"/>
+          <w:rFonts w:ascii="Aptos" w:hAnsi="Aptos" w:eastAsia="PingFang TC" w:cs="Aptos"/>
           <w:color w:val="263238"/>
         </w:rPr>
         <w:t>Agent Rina 是一個以同一套 AI 核心服務 Slack 與 Telegram 的多平台聊天機器人；平台差異留在介接與輸出層，推理、工具選擇與安全控制集中在共享的 Rina runtime。</w:t>
@@ -175,7 +175,7 @@
       </w:pPr>
       <w:r>
         <w:rPr>
-          <w:rFonts w:ascii="Arial Unicode MS" w:hAnsi="Arial Unicode MS" w:eastAsia="Arial Unicode MS"/>
+          <w:rFonts w:ascii="Aptos" w:hAnsi="Aptos" w:eastAsia="PingFang TC" w:cs="Aptos"/>
           <w:b/>
           <w:color w:val="263238"/>
         </w:rPr>
@@ -183,7 +183,7 @@
       </w:r>
       <w:r>
         <w:rPr>
-          <w:rFonts w:ascii="Arial Unicode MS" w:hAnsi="Arial Unicode MS" w:eastAsia="Arial Unicode MS"/>
+          <w:rFonts w:ascii="Aptos" w:hAnsi="Aptos" w:eastAsia="PingFang TC" w:cs="Aptos"/>
           <w:color w:val="263238"/>
         </w:rPr>
         <w:t>Next.js 16 App Router；Webhook 入口位於動態平台路由。</w:t>
@@ -199,7 +199,7 @@
       </w:pPr>
       <w:r>
         <w:rPr>
-          <w:rFonts w:ascii="Arial Unicode MS" w:hAnsi="Arial Unicode MS" w:eastAsia="Arial Unicode MS"/>
+          <w:rFonts w:ascii="Aptos" w:hAnsi="Aptos" w:eastAsia="PingFang TC" w:cs="Aptos"/>
           <w:b/>
           <w:color w:val="263238"/>
         </w:rPr>
@@ -207,7 +207,7 @@
       </w:r>
       <w:r>
         <w:rPr>
-          <w:rFonts w:ascii="Arial Unicode MS" w:hAnsi="Arial Unicode MS" w:eastAsia="Arial Unicode MS"/>
+          <w:rFonts w:ascii="Aptos" w:hAnsi="Aptos" w:eastAsia="PingFang TC" w:cs="Aptos"/>
           <w:color w:val="263238"/>
         </w:rPr>
         <w:t>Chat SDK 搭配 Slack、Telegram adapter 與 Redis state adapter。</w:t>
@@ -223,7 +223,7 @@
       </w:pPr>
       <w:r>
         <w:rPr>
-          <w:rFonts w:ascii="Arial Unicode MS" w:hAnsi="Arial Unicode MS" w:eastAsia="Arial Unicode MS"/>
+          <w:rFonts w:ascii="Aptos" w:hAnsi="Aptos" w:eastAsia="PingFang TC" w:cs="Aptos"/>
           <w:b/>
           <w:color w:val="263238"/>
         </w:rPr>
@@ -231,7 +231,7 @@
       </w:r>
       <w:r>
         <w:rPr>
-          <w:rFonts w:ascii="Arial Unicode MS" w:hAnsi="Arial Unicode MS" w:eastAsia="Arial Unicode MS"/>
+          <w:rFonts w:ascii="Aptos" w:hAnsi="Aptos" w:eastAsia="PingFang TC" w:cs="Aptos"/>
           <w:color w:val="263238"/>
         </w:rPr>
         <w:t>AI SDK ToolLoopAgent，透過 AI Gateway 呼叫模型，單次最多 20 steps。</w:t>
@@ -247,7 +247,7 @@
       </w:pPr>
       <w:r>
         <w:rPr>
-          <w:rFonts w:ascii="Arial Unicode MS" w:hAnsi="Arial Unicode MS" w:eastAsia="Arial Unicode MS"/>
+          <w:rFonts w:ascii="Aptos" w:hAnsi="Aptos" w:eastAsia="PingFang TC" w:cs="Aptos"/>
           <w:b/>
           <w:color w:val="263238"/>
         </w:rPr>
@@ -255,7 +255,7 @@
       </w:r>
       <w:r>
         <w:rPr>
-          <w:rFonts w:ascii="Arial Unicode MS" w:hAnsi="Arial Unicode MS" w:eastAsia="Arial Unicode MS"/>
+          <w:rFonts w:ascii="Aptos" w:hAnsi="Aptos" w:eastAsia="PingFang TC" w:cs="Aptos"/>
           <w:color w:val="263238"/>
         </w:rPr>
         <w:t>Web research、網頁內容與圖片擷取、arXiv 原始碼、Python sandbox、artifact 下載／上傳、bash 與 repo-local skills。</w:t>
@@ -271,7 +271,7 @@
       </w:pPr>
       <w:r>
         <w:rPr>
-          <w:rFonts w:ascii="Arial Unicode MS" w:hAnsi="Arial Unicode MS" w:eastAsia="Arial Unicode MS"/>
+          <w:rFonts w:ascii="Aptos" w:hAnsi="Aptos" w:eastAsia="PingFang TC" w:cs="Aptos"/>
           <w:b/>
           <w:color w:val="263238"/>
         </w:rPr>
@@ -279,7 +279,7 @@
       </w:r>
       <w:r>
         <w:rPr>
-          <w:rFonts w:ascii="Arial Unicode MS" w:hAnsi="Arial Unicode MS" w:eastAsia="Arial Unicode MS"/>
+          <w:rFonts w:ascii="Aptos" w:hAnsi="Aptos" w:eastAsia="PingFang TC" w:cs="Aptos"/>
           <w:color w:val="263238"/>
         </w:rPr>
         <w:t>TypeScript；套件管理以 pnpm 為主，並保留 npm lockfile。</w:t>
@@ -299,7 +299,7 @@
       </w:pPr>
       <w:r>
         <w:rPr>
-          <w:rFonts w:ascii="Arial Unicode MS" w:hAnsi="Arial Unicode MS" w:eastAsia="Arial Unicode MS"/>
+          <w:rFonts w:ascii="Aptos" w:hAnsi="Aptos" w:eastAsia="PingFang TC" w:cs="Aptos"/>
           <w:color w:val="263238"/>
         </w:rPr>
         <w:t>目前實作最清楚的三個設計選擇如下：</w:t>
@@ -315,7 +315,7 @@
       </w:pPr>
       <w:r>
         <w:rPr>
-          <w:rFonts w:ascii="Arial Unicode MS" w:hAnsi="Arial Unicode MS" w:eastAsia="Arial Unicode MS"/>
+          <w:rFonts w:ascii="Aptos" w:hAnsi="Aptos" w:eastAsia="PingFang TC" w:cs="Aptos"/>
           <w:color w:val="263238"/>
         </w:rPr>
         <w:t>共享核心：handlers、agent、tool registry 與 delivery bridge 不綁定單一聊天平台。</w:t>
@@ -331,7 +331,7 @@
       </w:pPr>
       <w:r>
         <w:rPr>
-          <w:rFonts w:ascii="Arial Unicode MS" w:hAnsi="Arial Unicode MS" w:eastAsia="Arial Unicode MS"/>
+          <w:rFonts w:ascii="Aptos" w:hAnsi="Aptos" w:eastAsia="PingFang TC" w:cs="Aptos"/>
           <w:color w:val="263238"/>
         </w:rPr>
         <w:t>意圖先行：planner 先以關鍵字與媒體類型判斷請求類別，前兩個推理步驟只啟用較相關的工具。</w:t>
@@ -347,7 +347,7 @@
       </w:pPr>
       <w:r>
         <w:rPr>
-          <w:rFonts w:ascii="Arial Unicode MS" w:hAnsi="Arial Unicode MS" w:eastAsia="Arial Unicode MS"/>
+          <w:rFonts w:ascii="Aptos" w:hAnsi="Aptos" w:eastAsia="PingFang TC" w:cs="Aptos"/>
           <w:color w:val="263238"/>
         </w:rPr>
         <w:t>I/O 邊界明確：存取控制、附件上限、safe fetch、sandbox、artifact 路徑與大小限制分散在實際執行邊界，而不是只靠模型提示。</w:t>
@@ -372,7 +372,7 @@
       </w:pPr>
       <w:r>
         <w:rPr>
-          <w:rFonts w:ascii="Arial Unicode MS" w:hAnsi="Arial Unicode MS" w:eastAsia="Arial Unicode MS"/>
+          <w:rFonts w:ascii="Aptos" w:hAnsi="Aptos" w:eastAsia="PingFang TC" w:cs="Aptos"/>
           <w:color w:val="263238"/>
         </w:rPr>
         <w:t>整體可以拆成四個區域：使用者通道、Web 邊緣、Rina 共享核心，以及外部模型／狀態／工具服務。訊息由平台 Webhook 進入，經 Chat SDK 統一成 thread 與 message，再交由 Rina 處理；回覆則沿 delivery bridge 回到原平台。</w:t>
@@ -427,7 +427,7 @@
       </w:pPr>
       <w:r>
         <w:rPr>
-          <w:rFonts w:ascii="Arial Unicode MS" w:hAnsi="Arial Unicode MS" w:eastAsia="Arial Unicode MS"/>
+          <w:rFonts w:ascii="Aptos" w:hAnsi="Aptos" w:eastAsia="PingFang TC" w:cs="Aptos"/>
           <w:i/>
           <w:color w:val="5E6E79"/>
           <w:sz w:val="18"/>
@@ -447,7 +447,7 @@
       </w:pPr>
       <w:r>
         <w:rPr>
-          <w:rFonts w:ascii="Arial Unicode MS" w:hAnsi="Arial Unicode MS" w:eastAsia="Arial Unicode MS"/>
+          <w:rFonts w:ascii="Aptos" w:hAnsi="Aptos" w:eastAsia="PingFang TC" w:cs="Aptos"/>
           <w:b/>
           <w:color w:val="183A61"/>
         </w:rPr>
@@ -455,7 +455,7 @@
       </w:r>
       <w:r>
         <w:rPr>
-          <w:rFonts w:ascii="Arial Unicode MS" w:hAnsi="Arial Unicode MS" w:eastAsia="Arial Unicode MS"/>
+          <w:rFonts w:ascii="Aptos" w:hAnsi="Aptos" w:eastAsia="PingFang TC" w:cs="Aptos"/>
           <w:color w:val="263238"/>
         </w:rPr>
         <w:t>Slack 與 Telegram 並不是兩套 bot；它們共享同一個 agent 與工具層。平台差異主要集中在事件觸發、處理中指示與回覆投遞方式。</w:t>
@@ -520,7 +520,7 @@
             <w:r/>
             <w:r>
               <w:rPr>
-                <w:rFonts w:ascii="Arial Unicode MS" w:hAnsi="Arial Unicode MS" w:eastAsia="Arial Unicode MS"/>
+                <w:rFonts w:ascii="Aptos" w:hAnsi="Aptos" w:eastAsia="PingFang TC" w:cs="Aptos"/>
                 <w:b/>
                 <w:color w:val="183A61"/>
                 <w:sz w:val="19"/>
@@ -543,7 +543,7 @@
             <w:r/>
             <w:r>
               <w:rPr>
-                <w:rFonts w:ascii="Arial Unicode MS" w:hAnsi="Arial Unicode MS" w:eastAsia="Arial Unicode MS"/>
+                <w:rFonts w:ascii="Aptos" w:hAnsi="Aptos" w:eastAsia="PingFang TC" w:cs="Aptos"/>
                 <w:b/>
                 <w:color w:val="183A61"/>
                 <w:sz w:val="19"/>
@@ -566,7 +566,7 @@
             <w:r/>
             <w:r>
               <w:rPr>
-                <w:rFonts w:ascii="Arial Unicode MS" w:hAnsi="Arial Unicode MS" w:eastAsia="Arial Unicode MS"/>
+                <w:rFonts w:ascii="Aptos" w:hAnsi="Aptos" w:eastAsia="PingFang TC" w:cs="Aptos"/>
                 <w:b/>
                 <w:color w:val="183A61"/>
                 <w:sz w:val="19"/>
@@ -593,7 +593,7 @@
             <w:r/>
             <w:r>
               <w:rPr>
-                <w:rFonts w:ascii="Arial Unicode MS" w:hAnsi="Arial Unicode MS" w:eastAsia="Arial Unicode MS"/>
+                <w:rFonts w:ascii="Aptos" w:hAnsi="Aptos" w:eastAsia="PingFang TC" w:cs="Aptos"/>
                 <w:b/>
                 <w:color w:val="263238"/>
                 <w:sz w:val="17"/>
@@ -615,7 +615,7 @@
             <w:r/>
             <w:r>
               <w:rPr>
-                <w:rFonts w:ascii="Calibri" w:hAnsi="Calibri" w:eastAsia="Arial Unicode MS"/>
+                <w:rFonts w:ascii="Aptos" w:hAnsi="Aptos" w:eastAsia="PingFang TC" w:cs="Aptos"/>
                 <w:b w:val="0"/>
                 <w:color w:val="263238"/>
                 <w:sz w:val="17"/>
@@ -637,7 +637,7 @@
             <w:r/>
             <w:r>
               <w:rPr>
-                <w:rFonts w:ascii="Arial Unicode MS" w:hAnsi="Arial Unicode MS" w:eastAsia="Arial Unicode MS"/>
+                <w:rFonts w:ascii="Aptos" w:hAnsi="Aptos" w:eastAsia="PingFang TC" w:cs="Aptos"/>
                 <w:b w:val="0"/>
                 <w:color w:val="263238"/>
                 <w:sz w:val="17"/>
@@ -665,7 +665,7 @@
             <w:r/>
             <w:r>
               <w:rPr>
-                <w:rFonts w:ascii="Arial Unicode MS" w:hAnsi="Arial Unicode MS" w:eastAsia="Arial Unicode MS"/>
+                <w:rFonts w:ascii="Aptos" w:hAnsi="Aptos" w:eastAsia="PingFang TC" w:cs="Aptos"/>
                 <w:b/>
                 <w:color w:val="263238"/>
                 <w:sz w:val="17"/>
@@ -688,7 +688,7 @@
             <w:r/>
             <w:r>
               <w:rPr>
-                <w:rFonts w:ascii="Calibri" w:hAnsi="Calibri" w:eastAsia="Arial Unicode MS"/>
+                <w:rFonts w:ascii="Aptos" w:hAnsi="Aptos" w:eastAsia="PingFang TC" w:cs="Aptos"/>
                 <w:b w:val="0"/>
                 <w:color w:val="263238"/>
                 <w:sz w:val="17"/>
@@ -711,7 +711,7 @@
             <w:r/>
             <w:r>
               <w:rPr>
-                <w:rFonts w:ascii="Arial Unicode MS" w:hAnsi="Arial Unicode MS" w:eastAsia="Arial Unicode MS"/>
+                <w:rFonts w:ascii="Aptos" w:hAnsi="Aptos" w:eastAsia="PingFang TC" w:cs="Aptos"/>
                 <w:b w:val="0"/>
                 <w:color w:val="263238"/>
                 <w:sz w:val="17"/>
@@ -738,7 +738,7 @@
             <w:r/>
             <w:r>
               <w:rPr>
-                <w:rFonts w:ascii="Arial Unicode MS" w:hAnsi="Arial Unicode MS" w:eastAsia="Arial Unicode MS"/>
+                <w:rFonts w:ascii="Aptos" w:hAnsi="Aptos" w:eastAsia="PingFang TC" w:cs="Aptos"/>
                 <w:b/>
                 <w:color w:val="263238"/>
                 <w:sz w:val="17"/>
@@ -760,7 +760,7 @@
             <w:r/>
             <w:r>
               <w:rPr>
-                <w:rFonts w:ascii="Calibri" w:hAnsi="Calibri" w:eastAsia="Arial Unicode MS"/>
+                <w:rFonts w:ascii="Aptos" w:hAnsi="Aptos" w:eastAsia="PingFang TC" w:cs="Aptos"/>
                 <w:b w:val="0"/>
                 <w:color w:val="263238"/>
                 <w:sz w:val="17"/>
@@ -782,7 +782,7 @@
             <w:r/>
             <w:r>
               <w:rPr>
-                <w:rFonts w:ascii="Arial Unicode MS" w:hAnsi="Arial Unicode MS" w:eastAsia="Arial Unicode MS"/>
+                <w:rFonts w:ascii="Aptos" w:hAnsi="Aptos" w:eastAsia="PingFang TC" w:cs="Aptos"/>
                 <w:b w:val="0"/>
                 <w:color w:val="263238"/>
                 <w:sz w:val="17"/>
@@ -810,7 +810,7 @@
             <w:r/>
             <w:r>
               <w:rPr>
-                <w:rFonts w:ascii="Arial Unicode MS" w:hAnsi="Arial Unicode MS" w:eastAsia="Arial Unicode MS"/>
+                <w:rFonts w:ascii="Aptos" w:hAnsi="Aptos" w:eastAsia="PingFang TC" w:cs="Aptos"/>
                 <w:b/>
                 <w:color w:val="263238"/>
                 <w:sz w:val="17"/>
@@ -833,7 +833,7 @@
             <w:r/>
             <w:r>
               <w:rPr>
-                <w:rFonts w:ascii="Calibri" w:hAnsi="Calibri" w:eastAsia="Arial Unicode MS"/>
+                <w:rFonts w:ascii="Aptos" w:hAnsi="Aptos" w:eastAsia="PingFang TC" w:cs="Aptos"/>
                 <w:b w:val="0"/>
                 <w:color w:val="263238"/>
                 <w:sz w:val="17"/>
@@ -856,7 +856,7 @@
             <w:r/>
             <w:r>
               <w:rPr>
-                <w:rFonts w:ascii="Arial Unicode MS" w:hAnsi="Arial Unicode MS" w:eastAsia="Arial Unicode MS"/>
+                <w:rFonts w:ascii="Aptos" w:hAnsi="Aptos" w:eastAsia="PingFang TC" w:cs="Aptos"/>
                 <w:b w:val="0"/>
                 <w:color w:val="263238"/>
                 <w:sz w:val="17"/>
@@ -883,7 +883,7 @@
             <w:r/>
             <w:r>
               <w:rPr>
-                <w:rFonts w:ascii="Arial Unicode MS" w:hAnsi="Arial Unicode MS" w:eastAsia="Arial Unicode MS"/>
+                <w:rFonts w:ascii="Aptos" w:hAnsi="Aptos" w:eastAsia="PingFang TC" w:cs="Aptos"/>
                 <w:b/>
                 <w:color w:val="263238"/>
                 <w:sz w:val="17"/>
@@ -905,7 +905,7 @@
             <w:r/>
             <w:r>
               <w:rPr>
-                <w:rFonts w:ascii="Calibri" w:hAnsi="Calibri" w:eastAsia="Arial Unicode MS"/>
+                <w:rFonts w:ascii="Aptos" w:hAnsi="Aptos" w:eastAsia="PingFang TC" w:cs="Aptos"/>
                 <w:b w:val="0"/>
                 <w:color w:val="263238"/>
                 <w:sz w:val="17"/>
@@ -929,7 +929,7 @@
             <w:r/>
             <w:r>
               <w:rPr>
-                <w:rFonts w:ascii="Arial Unicode MS" w:hAnsi="Arial Unicode MS" w:eastAsia="Arial Unicode MS"/>
+                <w:rFonts w:ascii="Aptos" w:hAnsi="Aptos" w:eastAsia="PingFang TC" w:cs="Aptos"/>
                 <w:b w:val="0"/>
                 <w:color w:val="263238"/>
                 <w:sz w:val="17"/>
@@ -957,7 +957,7 @@
             <w:r/>
             <w:r>
               <w:rPr>
-                <w:rFonts w:ascii="Arial Unicode MS" w:hAnsi="Arial Unicode MS" w:eastAsia="Arial Unicode MS"/>
+                <w:rFonts w:ascii="Aptos" w:hAnsi="Aptos" w:eastAsia="PingFang TC" w:cs="Aptos"/>
                 <w:b/>
                 <w:color w:val="263238"/>
                 <w:sz w:val="17"/>
@@ -980,7 +980,7 @@
             <w:r/>
             <w:r>
               <w:rPr>
-                <w:rFonts w:ascii="Calibri" w:hAnsi="Calibri" w:eastAsia="Arial Unicode MS"/>
+                <w:rFonts w:ascii="Aptos" w:hAnsi="Aptos" w:eastAsia="PingFang TC" w:cs="Aptos"/>
                 <w:b w:val="0"/>
                 <w:color w:val="263238"/>
                 <w:sz w:val="17"/>
@@ -1003,7 +1003,7 @@
             <w:r/>
             <w:r>
               <w:rPr>
-                <w:rFonts w:ascii="Arial Unicode MS" w:hAnsi="Arial Unicode MS" w:eastAsia="Arial Unicode MS"/>
+                <w:rFonts w:ascii="Aptos" w:hAnsi="Aptos" w:eastAsia="PingFang TC" w:cs="Aptos"/>
                 <w:b w:val="0"/>
                 <w:color w:val="263238"/>
                 <w:sz w:val="17"/>
@@ -1030,7 +1030,7 @@
             <w:r/>
             <w:r>
               <w:rPr>
-                <w:rFonts w:ascii="Arial Unicode MS" w:hAnsi="Arial Unicode MS" w:eastAsia="Arial Unicode MS"/>
+                <w:rFonts w:ascii="Aptos" w:hAnsi="Aptos" w:eastAsia="PingFang TC" w:cs="Aptos"/>
                 <w:b/>
                 <w:color w:val="263238"/>
                 <w:sz w:val="17"/>
@@ -1052,7 +1052,7 @@
             <w:r/>
             <w:r>
               <w:rPr>
-                <w:rFonts w:ascii="Calibri" w:hAnsi="Calibri" w:eastAsia="Arial Unicode MS"/>
+                <w:rFonts w:ascii="Aptos" w:hAnsi="Aptos" w:eastAsia="PingFang TC" w:cs="Aptos"/>
                 <w:b w:val="0"/>
                 <w:color w:val="263238"/>
                 <w:sz w:val="17"/>
@@ -1074,7 +1074,7 @@
             <w:r/>
             <w:r>
               <w:rPr>
-                <w:rFonts w:ascii="Arial Unicode MS" w:hAnsi="Arial Unicode MS" w:eastAsia="Arial Unicode MS"/>
+                <w:rFonts w:ascii="Aptos" w:hAnsi="Aptos" w:eastAsia="PingFang TC" w:cs="Aptos"/>
                 <w:b w:val="0"/>
                 <w:color w:val="263238"/>
                 <w:sz w:val="17"/>
@@ -1104,7 +1104,7 @@
       </w:pPr>
       <w:r>
         <w:rPr>
-          <w:rFonts w:ascii="Arial Unicode MS" w:hAnsi="Arial Unicode MS" w:eastAsia="Arial Unicode MS"/>
+          <w:rFonts w:ascii="Aptos" w:hAnsi="Aptos" w:eastAsia="PingFang TC" w:cs="Aptos"/>
           <w:color w:val="263238"/>
         </w:rPr>
         <w:t>下圖把一次請求濃縮成七個階段。真正的迴圈出現在 agent 與工具之間：模型可根據前一步工具結果繼續推理，直到產生回覆或達到 20-step 上限。</w:t>
@@ -1159,7 +1159,7 @@
       </w:pPr>
       <w:r>
         <w:rPr>
-          <w:rFonts w:ascii="Arial Unicode MS" w:hAnsi="Arial Unicode MS" w:eastAsia="Arial Unicode MS"/>
+          <w:rFonts w:ascii="Aptos" w:hAnsi="Aptos" w:eastAsia="PingFang TC" w:cs="Aptos"/>
           <w:i/>
           <w:color w:val="5E6E79"/>
           <w:sz w:val="18"/>
@@ -1185,7 +1185,7 @@
       </w:pPr>
       <w:r>
         <w:rPr>
-          <w:rFonts w:ascii="Arial Unicode MS" w:hAnsi="Arial Unicode MS" w:eastAsia="Arial Unicode MS"/>
+          <w:rFonts w:ascii="Aptos" w:hAnsi="Aptos" w:eastAsia="PingFang TC" w:cs="Aptos"/>
           <w:color w:val="263238"/>
         </w:rPr>
         <w:t>事件觸發：Slack／Telegram mention 會建立或進入 thread；訂閱後的訊息會持續交給同一 handler。Telegram 私訊不需要 mention，另由 catch-all handler 接住。</w:t>
@@ -1201,7 +1201,7 @@
       </w:pPr>
       <w:r>
         <w:rPr>
-          <w:rFonts w:ascii="Arial Unicode MS" w:hAnsi="Arial Unicode MS" w:eastAsia="Arial Unicode MS"/>
+          <w:rFonts w:ascii="Aptos" w:hAnsi="Aptos" w:eastAsia="PingFang TC" w:cs="Aptos"/>
           <w:color w:val="263238"/>
         </w:rPr>
         <w:t>存取與補強：平台專屬 allowlist 優先於全域 allowlist。Slack app_mention 可能缺附件，因此沒有附件時會重新 fetch 原訊息。</w:t>
@@ -1217,7 +1217,7 @@
       </w:pPr>
       <w:r>
         <w:rPr>
-          <w:rFonts w:ascii="Arial Unicode MS" w:hAnsi="Arial Unicode MS" w:eastAsia="Arial Unicode MS"/>
+          <w:rFonts w:ascii="Aptos" w:hAnsi="Aptos" w:eastAsia="PingFang TC" w:cs="Aptos"/>
           <w:color w:val="263238"/>
         </w:rPr>
         <w:t>脈絡組裝：新訊息轉成 text、image 或 file parts；follow-up 另取得 thread history 與可能存在的新聞摘要 context，兩者平行讀取。</w:t>
@@ -1233,7 +1233,7 @@
       </w:pPr>
       <w:r>
         <w:rPr>
-          <w:rFonts w:ascii="Arial Unicode MS" w:hAnsi="Arial Unicode MS" w:eastAsia="Arial Unicode MS"/>
+          <w:rFonts w:ascii="Aptos" w:hAnsi="Aptos" w:eastAsia="PingFang TC" w:cs="Aptos"/>
           <w:color w:val="263238"/>
         </w:rPr>
         <w:t>意圖規劃：planner 判斷 paper、research、data、codebase、artifact、file 或 chat。這是工具相關性優化，不是永久權限隔離。</w:t>
@@ -1249,7 +1249,7 @@
       </w:pPr>
       <w:r>
         <w:rPr>
-          <w:rFonts w:ascii="Arial Unicode MS" w:hAnsi="Arial Unicode MS" w:eastAsia="Arial Unicode MS"/>
+          <w:rFonts w:ascii="Aptos" w:hAnsi="Aptos" w:eastAsia="PingFang TC" w:cs="Aptos"/>
           <w:color w:val="263238"/>
         </w:rPr>
         <w:t>推理與工具：前兩個 steps 只開啟 intent 對應的工具；之後 agent 可以看見完整工具集。所有工具結果再回到模型，直到形成回答。</w:t>
@@ -1265,7 +1265,7 @@
       </w:pPr>
       <w:r>
         <w:rPr>
-          <w:rFonts w:ascii="Arial Unicode MS" w:hAnsi="Arial Unicode MS" w:eastAsia="Arial Unicode MS"/>
+          <w:rFonts w:ascii="Aptos" w:hAnsi="Aptos" w:eastAsia="PingFang TC" w:cs="Aptos"/>
           <w:color w:val="263238"/>
         </w:rPr>
         <w:t>交付：Slack 使用串流橋接；Telegram 累積一段文字後再送，並把超過 4,000 字的內容分割。結構化 file-upload 結果會被攔截成聊天附件。</w:t>
@@ -1285,7 +1285,7 @@
       </w:pPr>
       <w:r>
         <w:rPr>
-          <w:rFonts w:ascii="Calibri" w:hAnsi="Calibri" w:eastAsia="Arial Unicode MS"/>
+          <w:rFonts w:ascii="Aptos" w:hAnsi="Aptos" w:eastAsia="PingFang TC" w:cs="Aptos"/>
           <w:b/>
           <w:color w:val="263238"/>
         </w:rPr>
@@ -1293,7 +1293,7 @@
       </w:r>
       <w:r>
         <w:rPr>
-          <w:rFonts w:ascii="Calibri" w:hAnsi="Calibri" w:eastAsia="Arial Unicode MS"/>
+          <w:rFonts w:ascii="Aptos" w:hAnsi="Aptos" w:eastAsia="PingFang TC" w:cs="Aptos"/>
           <w:color w:val="263238"/>
         </w:rPr>
       </w:r>
@@ -1308,7 +1308,7 @@
       </w:pPr>
       <w:r>
         <w:rPr>
-          <w:rFonts w:ascii="Arial Unicode MS" w:hAnsi="Arial Unicode MS" w:eastAsia="Arial Unicode MS"/>
+          <w:rFonts w:ascii="Aptos" w:hAnsi="Aptos" w:eastAsia="PingFang TC" w:cs="Aptos"/>
           <w:color w:val="263238"/>
         </w:rPr>
         <w:t>新 mention 會訂閱 thread，後續訊息由 onSubscribedMessage 處理。</w:t>
@@ -1324,7 +1324,7 @@
       </w:pPr>
       <w:r>
         <w:rPr>
-          <w:rFonts w:ascii="Arial Unicode MS" w:hAnsi="Arial Unicode MS" w:eastAsia="Arial Unicode MS"/>
+          <w:rFonts w:ascii="Aptos" w:hAnsi="Aptos" w:eastAsia="PingFang TC" w:cs="Aptos"/>
           <w:color w:val="263238"/>
         </w:rPr>
         <w:t>收到請求時最佳努力加上 eyes；成功後移除 eyes 並加上 check，失敗時清掉指示。</w:t>
@@ -1340,7 +1340,7 @@
       </w:pPr>
       <w:r>
         <w:rPr>
-          <w:rFonts w:ascii="Arial Unicode MS" w:hAnsi="Arial Unicode MS" w:eastAsia="Arial Unicode MS"/>
+          <w:rFonts w:ascii="Aptos" w:hAnsi="Aptos" w:eastAsia="PingFang TC" w:cs="Aptos"/>
           <w:color w:val="263238"/>
         </w:rPr>
         <w:t>文字以 AsyncIterable 即時串流；工具狀態與檔案另行張貼。</w:t>
@@ -1352,7 +1352,7 @@
       </w:pPr>
       <w:r>
         <w:rPr>
-          <w:rFonts w:ascii="Calibri" w:hAnsi="Calibri" w:eastAsia="Arial Unicode MS"/>
+          <w:rFonts w:ascii="Aptos" w:hAnsi="Aptos" w:eastAsia="PingFang TC" w:cs="Aptos"/>
           <w:b/>
           <w:color w:val="263238"/>
         </w:rPr>
@@ -1360,7 +1360,7 @@
       </w:r>
       <w:r>
         <w:rPr>
-          <w:rFonts w:ascii="Calibri" w:hAnsi="Calibri" w:eastAsia="Arial Unicode MS"/>
+          <w:rFonts w:ascii="Aptos" w:hAnsi="Aptos" w:eastAsia="PingFang TC" w:cs="Aptos"/>
           <w:color w:val="263238"/>
         </w:rPr>
       </w:r>
@@ -1375,7 +1375,7 @@
       </w:pPr>
       <w:r>
         <w:rPr>
-          <w:rFonts w:ascii="Arial Unicode MS" w:hAnsi="Arial Unicode MS" w:eastAsia="Arial Unicode MS"/>
+          <w:rFonts w:ascii="Aptos" w:hAnsi="Aptos" w:eastAsia="PingFang TC" w:cs="Aptos"/>
           <w:color w:val="263238"/>
         </w:rPr>
         <w:t>群組／supergroup 依 mention 觸發；DM 由廣泛訊息 matcher 接住。</w:t>
@@ -1391,7 +1391,7 @@
       </w:pPr>
       <w:r>
         <w:rPr>
-          <w:rFonts w:ascii="Arial Unicode MS" w:hAnsi="Arial Unicode MS" w:eastAsia="Arial Unicode MS"/>
+          <w:rFonts w:ascii="Aptos" w:hAnsi="Aptos" w:eastAsia="PingFang TC" w:cs="Aptos"/>
           <w:color w:val="263238"/>
         </w:rPr>
         <w:t>文字緩衝後送出，長訊息優先在段落或換行處切分。</w:t>
@@ -1407,7 +1407,7 @@
       </w:pPr>
       <w:r>
         <w:rPr>
-          <w:rFonts w:ascii="Arial Unicode MS" w:hAnsi="Arial Unicode MS" w:eastAsia="Arial Unicode MS"/>
+          <w:rFonts w:ascii="Aptos" w:hAnsi="Aptos" w:eastAsia="PingFang TC" w:cs="Aptos"/>
           <w:color w:val="263238"/>
         </w:rPr>
         <w:t>若 Telegram 拒絕 Markdown entity，delivery 會改以 raw text 重送。</w:t>
@@ -1432,7 +1432,7 @@
       </w:pPr>
       <w:r>
         <w:rPr>
-          <w:rFonts w:ascii="Arial Unicode MS" w:hAnsi="Arial Unicode MS" w:eastAsia="Arial Unicode MS"/>
+          <w:rFonts w:ascii="Aptos" w:hAnsi="Aptos" w:eastAsia="PingFang TC" w:cs="Aptos"/>
           <w:color w:val="263238"/>
         </w:rPr>
         <w:t>Agent Rina 的工具設計分成兩層：registry 決定『什麼情境先看見哪些工具』，每一個真正接觸網路、檔案或執行環境的工具再自行落實安全限制。這兩層用途不同，不能互相取代。</w:t>
@@ -1487,7 +1487,7 @@
       </w:pPr>
       <w:r>
         <w:rPr>
-          <w:rFonts w:ascii="Arial Unicode MS" w:hAnsi="Arial Unicode MS" w:eastAsia="Arial Unicode MS"/>
+          <w:rFonts w:ascii="Aptos" w:hAnsi="Aptos" w:eastAsia="PingFang TC" w:cs="Aptos"/>
           <w:i/>
           <w:color w:val="5E6E79"/>
           <w:sz w:val="18"/>
@@ -1509,7 +1509,7 @@
       </w:pPr>
       <w:r>
         <w:rPr>
-          <w:rFonts w:ascii="Calibri" w:hAnsi="Calibri" w:eastAsia="Arial Unicode MS"/>
+          <w:rFonts w:ascii="Aptos" w:hAnsi="Aptos" w:eastAsia="PingFang TC" w:cs="Aptos"/>
           <w:b/>
           <w:color w:val="263238"/>
         </w:rPr>
@@ -1517,7 +1517,7 @@
       </w:r>
       <w:r>
         <w:rPr>
-          <w:rFonts w:ascii="Arial Unicode MS" w:hAnsi="Arial Unicode MS" w:eastAsia="Arial Unicode MS"/>
+          <w:rFonts w:ascii="Aptos" w:hAnsi="Aptos" w:eastAsia="PingFang TC" w:cs="Aptos"/>
           <w:color w:val="263238"/>
         </w:rPr>
         <w:t>webSearch 透過 Gemini grounding 產生附來源回答；perplexitySearch 偏即時資訊；researchWeb 平行交叉兩者；fetchWebpage 讀單一 URL。</w:t>
@@ -1529,7 +1529,7 @@
       </w:pPr>
       <w:r>
         <w:rPr>
-          <w:rFonts w:ascii="Arial Unicode MS" w:hAnsi="Arial Unicode MS" w:eastAsia="Arial Unicode MS"/>
+          <w:rFonts w:ascii="Aptos" w:hAnsi="Aptos" w:eastAsia="PingFang TC" w:cs="Aptos"/>
           <w:b/>
           <w:color w:val="263238"/>
         </w:rPr>
@@ -1537,7 +1537,7 @@
       </w:r>
       <w:r>
         <w:rPr>
-          <w:rFonts w:ascii="Arial Unicode MS" w:hAnsi="Arial Unicode MS" w:eastAsia="Arial Unicode MS"/>
+          <w:rFonts w:ascii="Aptos" w:hAnsi="Aptos" w:eastAsia="PingFang TC" w:cs="Aptos"/>
           <w:color w:val="263238"/>
         </w:rPr>
         <w:t>extractWebpageAssets 以 safe fetch 取得 HTML，使用 Defuddle 擷取內容、從 metadata／JSON-LD／DOM 找圖、排序候選並把通過驗證的圖片轉成 file-upload 結果。</w:t>
@@ -1549,7 +1549,7 @@
       </w:pPr>
       <w:r>
         <w:rPr>
-          <w:rFonts w:ascii="Arial Unicode MS" w:hAnsi="Arial Unicode MS" w:eastAsia="Arial Unicode MS"/>
+          <w:rFonts w:ascii="Aptos" w:hAnsi="Aptos" w:eastAsia="PingFang TC" w:cs="Aptos"/>
           <w:b/>
           <w:color w:val="263238"/>
         </w:rPr>
@@ -1557,7 +1557,7 @@
       </w:r>
       <w:r>
         <w:rPr>
-          <w:rFonts w:ascii="Arial Unicode MS" w:hAnsi="Arial Unicode MS" w:eastAsia="Arial Unicode MS"/>
+          <w:rFonts w:ascii="Aptos" w:hAnsi="Aptos" w:eastAsia="PingFang TC" w:cs="Aptos"/>
           <w:color w:val="263238"/>
         </w:rPr>
         <w:t>downloadArxivSource 下載並解壓 LaTeX source；listPaperFiles、readPaperFile 與 uploadPaperFigure 支援分段理解與圖表回傳。</w:t>
@@ -1569,7 +1569,7 @@
       </w:pPr>
       <w:r>
         <w:rPr>
-          <w:rFonts w:ascii="Arial Unicode MS" w:hAnsi="Arial Unicode MS" w:eastAsia="Arial Unicode MS"/>
+          <w:rFonts w:ascii="Aptos" w:hAnsi="Aptos" w:eastAsia="PingFang TC" w:cs="Aptos"/>
           <w:b/>
           <w:color w:val="263238"/>
         </w:rPr>
@@ -1577,7 +1577,7 @@
       </w:r>
       <w:r>
         <w:rPr>
-          <w:rFonts w:ascii="Arial Unicode MS" w:hAnsi="Arial Unicode MS" w:eastAsia="Arial Unicode MS"/>
+          <w:rFonts w:ascii="Aptos" w:hAnsi="Aptos" w:eastAsia="PingFang TC" w:cs="Aptos"/>
           <w:color w:val="263238"/>
         </w:rPr>
         <w:t>runPythonCode 在 Vercel Sandbox microVM 執行 Python，可安裝套件、擷取 stdout/stderr，並將指定輸出檔送回 artifacts。</w:t>
@@ -1589,7 +1589,7 @@
       </w:pPr>
       <w:r>
         <w:rPr>
-          <w:rFonts w:ascii="Arial Unicode MS" w:hAnsi="Arial Unicode MS" w:eastAsia="Arial Unicode MS"/>
+          <w:rFonts w:ascii="Aptos" w:hAnsi="Aptos" w:eastAsia="PingFang TC" w:cs="Aptos"/>
           <w:b/>
           <w:color w:val="263238"/>
         </w:rPr>
@@ -1597,7 +1597,7 @@
       </w:r>
       <w:r>
         <w:rPr>
-          <w:rFonts w:ascii="Arial Unicode MS" w:hAnsi="Arial Unicode MS" w:eastAsia="Arial Unicode MS"/>
+          <w:rFonts w:ascii="Aptos" w:hAnsi="Aptos" w:eastAsia="PingFang TC" w:cs="Aptos"/>
           <w:color w:val="263238"/>
         </w:rPr>
         <w:t>bash-tool 與 skill tool 延遲載入；bash upload scope 限制在 app、lib、docs、.agents 內的程式與設定類檔案。</w:t>
@@ -1609,7 +1609,7 @@
       </w:pPr>
       <w:r>
         <w:rPr>
-          <w:rFonts w:ascii="Calibri" w:hAnsi="Calibri" w:eastAsia="Arial Unicode MS"/>
+          <w:rFonts w:ascii="Aptos" w:hAnsi="Aptos" w:eastAsia="PingFang TC" w:cs="Aptos"/>
           <w:b/>
           <w:color w:val="263238"/>
         </w:rPr>
@@ -1617,10 +1617,15 @@
       </w:r>
       <w:r>
         <w:rPr>
-          <w:rFonts w:ascii="Arial Unicode MS" w:hAnsi="Arial Unicode MS" w:eastAsia="Arial Unicode MS"/>
+          <w:rFonts w:ascii="Aptos" w:hAnsi="Aptos" w:eastAsia="PingFang TC" w:cs="Aptos"/>
           <w:color w:val="263238"/>
         </w:rPr>
         <w:t>downloadFile、listArtifacts、uploadArtifact 管理 artifacts/，並透過結構化結果讓 delivery 統一投遞。</w:t>
+      </w:r>
+    </w:p>
+    <w:p>
+      <w:r>
+        <w:br w:type="page"/>
       </w:r>
     </w:p>
     <w:p>
@@ -1676,7 +1681,7 @@
             <w:r/>
             <w:r>
               <w:rPr>
-                <w:rFonts w:ascii="Arial Unicode MS" w:hAnsi="Arial Unicode MS" w:eastAsia="Arial Unicode MS"/>
+                <w:rFonts w:ascii="Aptos" w:hAnsi="Aptos" w:eastAsia="PingFang TC" w:cs="Aptos"/>
                 <w:b/>
                 <w:color w:val="183A61"/>
                 <w:sz w:val="19"/>
@@ -1699,7 +1704,7 @@
             <w:r/>
             <w:r>
               <w:rPr>
-                <w:rFonts w:ascii="Arial Unicode MS" w:hAnsi="Arial Unicode MS" w:eastAsia="Arial Unicode MS"/>
+                <w:rFonts w:ascii="Aptos" w:hAnsi="Aptos" w:eastAsia="PingFang TC" w:cs="Aptos"/>
                 <w:b/>
                 <w:color w:val="183A61"/>
                 <w:sz w:val="19"/>
@@ -1725,7 +1730,7 @@
             <w:r/>
             <w:r>
               <w:rPr>
-                <w:rFonts w:ascii="Arial Unicode MS" w:hAnsi="Arial Unicode MS" w:eastAsia="Arial Unicode MS"/>
+                <w:rFonts w:ascii="Aptos" w:hAnsi="Aptos" w:eastAsia="PingFang TC" w:cs="Aptos"/>
                 <w:b/>
                 <w:color w:val="263238"/>
                 <w:sz w:val="18"/>
@@ -1746,7 +1751,7 @@
             <w:r/>
             <w:r>
               <w:rPr>
-                <w:rFonts w:ascii="Arial Unicode MS" w:hAnsi="Arial Unicode MS" w:eastAsia="Arial Unicode MS"/>
+                <w:rFonts w:ascii="Aptos" w:hAnsi="Aptos" w:eastAsia="PingFang TC" w:cs="Aptos"/>
                 <w:b w:val="0"/>
                 <w:color w:val="263238"/>
                 <w:sz w:val="17"/>
@@ -1773,7 +1778,7 @@
             <w:r/>
             <w:r>
               <w:rPr>
-                <w:rFonts w:ascii="Arial Unicode MS" w:hAnsi="Arial Unicode MS" w:eastAsia="Arial Unicode MS"/>
+                <w:rFonts w:ascii="Aptos" w:hAnsi="Aptos" w:eastAsia="PingFang TC" w:cs="Aptos"/>
                 <w:b/>
                 <w:color w:val="263238"/>
                 <w:sz w:val="18"/>
@@ -1795,7 +1800,7 @@
             <w:r/>
             <w:r>
               <w:rPr>
-                <w:rFonts w:ascii="Arial Unicode MS" w:hAnsi="Arial Unicode MS" w:eastAsia="Arial Unicode MS"/>
+                <w:rFonts w:ascii="Aptos" w:hAnsi="Aptos" w:eastAsia="PingFang TC" w:cs="Aptos"/>
                 <w:b w:val="0"/>
                 <w:color w:val="263238"/>
                 <w:sz w:val="17"/>
@@ -1821,7 +1826,7 @@
             <w:r/>
             <w:r>
               <w:rPr>
-                <w:rFonts w:ascii="Calibri" w:hAnsi="Calibri" w:eastAsia="Arial Unicode MS"/>
+                <w:rFonts w:ascii="Aptos" w:hAnsi="Aptos" w:eastAsia="PingFang TC" w:cs="Aptos"/>
                 <w:b/>
                 <w:color w:val="263238"/>
                 <w:sz w:val="18"/>
@@ -1842,7 +1847,7 @@
             <w:r/>
             <w:r>
               <w:rPr>
-                <w:rFonts w:ascii="Arial Unicode MS" w:hAnsi="Arial Unicode MS" w:eastAsia="Arial Unicode MS"/>
+                <w:rFonts w:ascii="Aptos" w:hAnsi="Aptos" w:eastAsia="PingFang TC" w:cs="Aptos"/>
                 <w:b w:val="0"/>
                 <w:color w:val="263238"/>
                 <w:sz w:val="17"/>
@@ -1869,7 +1874,7 @@
             <w:r/>
             <w:r>
               <w:rPr>
-                <w:rFonts w:ascii="Calibri" w:hAnsi="Calibri" w:eastAsia="Arial Unicode MS"/>
+                <w:rFonts w:ascii="Aptos" w:hAnsi="Aptos" w:eastAsia="PingFang TC" w:cs="Aptos"/>
                 <w:b/>
                 <w:color w:val="263238"/>
                 <w:sz w:val="18"/>
@@ -1891,7 +1896,7 @@
             <w:r/>
             <w:r>
               <w:rPr>
-                <w:rFonts w:ascii="Arial Unicode MS" w:hAnsi="Arial Unicode MS" w:eastAsia="Arial Unicode MS"/>
+                <w:rFonts w:ascii="Aptos" w:hAnsi="Aptos" w:eastAsia="PingFang TC" w:cs="Aptos"/>
                 <w:b w:val="0"/>
                 <w:color w:val="263238"/>
                 <w:sz w:val="17"/>
@@ -1917,7 +1922,7 @@
             <w:r/>
             <w:r>
               <w:rPr>
-                <w:rFonts w:ascii="Calibri" w:hAnsi="Calibri" w:eastAsia="Arial Unicode MS"/>
+                <w:rFonts w:ascii="Aptos" w:hAnsi="Aptos" w:eastAsia="PingFang TC" w:cs="Aptos"/>
                 <w:b/>
                 <w:color w:val="263238"/>
                 <w:sz w:val="18"/>
@@ -1938,7 +1943,7 @@
             <w:r/>
             <w:r>
               <w:rPr>
-                <w:rFonts w:ascii="Arial Unicode MS" w:hAnsi="Arial Unicode MS" w:eastAsia="Arial Unicode MS"/>
+                <w:rFonts w:ascii="Aptos" w:hAnsi="Aptos" w:eastAsia="PingFang TC" w:cs="Aptos"/>
                 <w:b w:val="0"/>
                 <w:color w:val="263238"/>
                 <w:sz w:val="17"/>
@@ -1965,7 +1970,7 @@
             <w:r/>
             <w:r>
               <w:rPr>
-                <w:rFonts w:ascii="Arial Unicode MS" w:hAnsi="Arial Unicode MS" w:eastAsia="Arial Unicode MS"/>
+                <w:rFonts w:ascii="Aptos" w:hAnsi="Aptos" w:eastAsia="PingFang TC" w:cs="Aptos"/>
                 <w:b/>
                 <w:color w:val="263238"/>
                 <w:sz w:val="18"/>
@@ -1987,7 +1992,7 @@
             <w:r/>
             <w:r>
               <w:rPr>
-                <w:rFonts w:ascii="Arial Unicode MS" w:hAnsi="Arial Unicode MS" w:eastAsia="Arial Unicode MS"/>
+                <w:rFonts w:ascii="Aptos" w:hAnsi="Aptos" w:eastAsia="PingFang TC" w:cs="Aptos"/>
                 <w:b w:val="0"/>
                 <w:color w:val="263238"/>
                 <w:sz w:val="17"/>
@@ -2025,7 +2030,7 @@
       </w:pPr>
       <w:r>
         <w:rPr>
-          <w:rFonts w:ascii="Arial Unicode MS" w:hAnsi="Arial Unicode MS" w:eastAsia="Arial Unicode MS"/>
+          <w:rFonts w:ascii="Aptos" w:hAnsi="Aptos" w:eastAsia="PingFang TC" w:cs="Aptos"/>
           <w:color w:val="263238"/>
         </w:rPr>
         <w:t>Chat SDK 的 state adapter 由 Redis 提供。follow-up 請求會讀取整個 thread，略過本次訊息，將 bot 訊息映射為 assistant、其他人訊息映射為 user；連續同角色訊息會合併，以符合部分 provider 對角色交替的要求。最後保留最近 RINA_MAX_HISTORY_MESSAGES 筆，預設為 30。</w:t>
@@ -2037,7 +2042,7 @@
       </w:pPr>
       <w:r>
         <w:rPr>
-          <w:rFonts w:ascii="Arial Unicode MS" w:hAnsi="Arial Unicode MS" w:eastAsia="Arial Unicode MS"/>
+          <w:rFonts w:ascii="Aptos" w:hAnsi="Aptos" w:eastAsia="PingFang TC" w:cs="Aptos"/>
           <w:color w:val="263238"/>
         </w:rPr>
         <w:t>Bot 自己張貼的附件會被轉成一則合成 user context：『This is the file you just posted to the chat.』如此一來，後續使用者說『剛才那張圖』時，模型仍能看見它。</w:t>
@@ -2057,7 +2062,7 @@
       </w:pPr>
       <w:r>
         <w:rPr>
-          <w:rFonts w:ascii="Arial Unicode MS" w:hAnsi="Arial Unicode MS" w:eastAsia="Arial Unicode MS"/>
+          <w:rFonts w:ascii="Aptos" w:hAnsi="Aptos" w:eastAsia="PingFang TC" w:cs="Aptos"/>
           <w:color w:val="263238"/>
         </w:rPr>
         <w:t>lib/bot/news/ 目前已有 RSS 抓取與去重、AI 篩選摘要，以及把 digest 與 stories 存入 Redis 的 primitives。digest thread context 使用 news:digest-thread: 前綴，TTL 為 14 天；follow-up handler 會把找到的 digest 以前導訊息加入模型脈絡。</w:t>
@@ -2075,7 +2080,7 @@
       </w:pPr>
       <w:r>
         <w:rPr>
-          <w:rFonts w:ascii="Arial Unicode MS" w:hAnsi="Arial Unicode MS" w:eastAsia="Arial Unicode MS"/>
+          <w:rFonts w:ascii="Aptos" w:hAnsi="Aptos" w:eastAsia="PingFang TC" w:cs="Aptos"/>
           <w:b/>
           <w:color w:val="183A61"/>
         </w:rPr>
@@ -2083,7 +2088,7 @@
       </w:r>
       <w:r>
         <w:rPr>
-          <w:rFonts w:ascii="Arial Unicode MS" w:hAnsi="Arial Unicode MS" w:eastAsia="Arial Unicode MS"/>
+          <w:rFonts w:ascii="Aptos" w:hAnsi="Aptos" w:eastAsia="PingFang TC" w:cs="Aptos"/>
           <w:color w:val="263238"/>
         </w:rPr>
         <w:t>目前程式樹沒有找到排程、發文或 saveDigestThreadContext 的實際呼叫點。instrumentation.ts 的註解寫著會 eager import bot 以啟動 node-cron，但 lib/bot/index.ts 尚未建立 scheduler。可把新聞功能視為『核心零件已存在、產品流程尚未串接』。</w:t>
@@ -2107,7 +2112,7 @@
       </w:pPr>
       <w:r>
         <w:rPr>
-          <w:rFonts w:ascii="Arial Unicode MS" w:hAnsi="Arial Unicode MS" w:eastAsia="Arial Unicode MS"/>
+          <w:rFonts w:ascii="Aptos" w:hAnsi="Aptos" w:eastAsia="PingFang TC" w:cs="Aptos"/>
           <w:color w:val="263238"/>
         </w:rPr>
         <w:t>ThreadLogger 由 handler 以平台與 thread ID 建立，記錄分隔線、輸入、歷史、完整 prompt、plan、active tools、工具呼叫／結果與最終文字區塊。</w:t>
@@ -2123,7 +2128,7 @@
       </w:pPr>
       <w:r>
         <w:rPr>
-          <w:rFonts w:ascii="Arial Unicode MS" w:hAnsi="Arial Unicode MS" w:eastAsia="Arial Unicode MS"/>
+          <w:rFonts w:ascii="Aptos" w:hAnsi="Aptos" w:eastAsia="PingFang TC" w:cs="Aptos"/>
           <w:color w:val="263238"/>
         </w:rPr>
         <w:t>withLogging() 只是 tap stream，不改變下游看到的事件；工具輸出若包含 dataBase64，log 只留下字串長度。</w:t>
@@ -2139,7 +2144,7 @@
       </w:pPr>
       <w:r>
         <w:rPr>
-          <w:rFonts w:ascii="Arial Unicode MS" w:hAnsi="Arial Unicode MS" w:eastAsia="Arial Unicode MS"/>
+          <w:rFonts w:ascii="Aptos" w:hAnsi="Aptos" w:eastAsia="PingFang TC" w:cs="Aptos"/>
           <w:color w:val="263238"/>
         </w:rPr>
         <w:t>RINA_IMAGE_DEBUG=1 可開啟附件與模型 message 組裝細節，適合追查 Slack 附件遺失、MIME 推斷或歷史媒體問題。</w:t>
@@ -2155,10 +2160,15 @@
       </w:pPr>
       <w:r>
         <w:rPr>
-          <w:rFonts w:ascii="Arial Unicode MS" w:hAnsi="Arial Unicode MS" w:eastAsia="Arial Unicode MS"/>
+          <w:rFonts w:ascii="Aptos" w:hAnsi="Aptos" w:eastAsia="PingFang TC" w:cs="Aptos"/>
           <w:color w:val="263238"/>
         </w:rPr>
         <w:t>Handler boundary 捕捉整次執行錯誤，向使用者回覆簡短 internal error，並在 finally 內處理 Slack reaction。</w:t>
+      </w:r>
+    </w:p>
+    <w:p>
+      <w:r>
+        <w:br w:type="page"/>
       </w:r>
     </w:p>
     <w:p>
@@ -2223,7 +2233,7 @@
             <w:r/>
             <w:r>
               <w:rPr>
-                <w:rFonts w:ascii="Arial Unicode MS" w:hAnsi="Arial Unicode MS" w:eastAsia="Arial Unicode MS"/>
+                <w:rFonts w:ascii="Aptos" w:hAnsi="Aptos" w:eastAsia="PingFang TC" w:cs="Aptos"/>
                 <w:b/>
                 <w:color w:val="183A61"/>
                 <w:sz w:val="19"/>
@@ -2246,7 +2256,7 @@
             <w:r/>
             <w:r>
               <w:rPr>
-                <w:rFonts w:ascii="Arial Unicode MS" w:hAnsi="Arial Unicode MS" w:eastAsia="Arial Unicode MS"/>
+                <w:rFonts w:ascii="Aptos" w:hAnsi="Aptos" w:eastAsia="PingFang TC" w:cs="Aptos"/>
                 <w:b/>
                 <w:color w:val="183A61"/>
                 <w:sz w:val="19"/>
@@ -2269,7 +2279,7 @@
             <w:r/>
             <w:r>
               <w:rPr>
-                <w:rFonts w:ascii="Arial Unicode MS" w:hAnsi="Arial Unicode MS" w:eastAsia="Arial Unicode MS"/>
+                <w:rFonts w:ascii="Aptos" w:hAnsi="Aptos" w:eastAsia="PingFang TC" w:cs="Aptos"/>
                 <w:b/>
                 <w:color w:val="183A61"/>
                 <w:sz w:val="19"/>
@@ -2295,7 +2305,7 @@
             <w:r/>
             <w:r>
               <w:rPr>
-                <w:rFonts w:ascii="Calibri" w:hAnsi="Calibri" w:eastAsia="Arial Unicode MS"/>
+                <w:rFonts w:ascii="Aptos" w:hAnsi="Aptos" w:eastAsia="PingFang TC" w:cs="Aptos"/>
                 <w:b/>
                 <w:color w:val="263238"/>
                 <w:sz w:val="17"/>
@@ -2317,7 +2327,7 @@
             <w:r/>
             <w:r>
               <w:rPr>
-                <w:rFonts w:ascii="Arial Unicode MS" w:hAnsi="Arial Unicode MS" w:eastAsia="Arial Unicode MS"/>
+                <w:rFonts w:ascii="Aptos" w:hAnsi="Aptos" w:eastAsia="PingFang TC" w:cs="Aptos"/>
                 <w:b w:val="0"/>
                 <w:color w:val="263238"/>
                 <w:sz w:val="17"/>
@@ -2338,7 +2348,7 @@
             <w:r/>
             <w:r>
               <w:rPr>
-                <w:rFonts w:ascii="Arial Unicode MS" w:hAnsi="Arial Unicode MS" w:eastAsia="Arial Unicode MS"/>
+                <w:rFonts w:ascii="Aptos" w:hAnsi="Aptos" w:eastAsia="PingFang TC" w:cs="Aptos"/>
                 <w:b w:val="0"/>
                 <w:color w:val="263238"/>
                 <w:sz w:val="17"/>
@@ -2365,7 +2375,7 @@
             <w:r/>
             <w:r>
               <w:rPr>
-                <w:rFonts w:ascii="Calibri" w:hAnsi="Calibri" w:eastAsia="Arial Unicode MS"/>
+                <w:rFonts w:ascii="Aptos" w:hAnsi="Aptos" w:eastAsia="PingFang TC" w:cs="Aptos"/>
                 <w:b/>
                 <w:color w:val="263238"/>
                 <w:sz w:val="17"/>
@@ -2388,7 +2398,7 @@
             <w:r/>
             <w:r>
               <w:rPr>
-                <w:rFonts w:ascii="Arial Unicode MS" w:hAnsi="Arial Unicode MS" w:eastAsia="Arial Unicode MS"/>
+                <w:rFonts w:ascii="Aptos" w:hAnsi="Aptos" w:eastAsia="PingFang TC" w:cs="Aptos"/>
                 <w:b w:val="0"/>
                 <w:color w:val="263238"/>
                 <w:sz w:val="17"/>
@@ -2410,7 +2420,7 @@
             <w:r/>
             <w:r>
               <w:rPr>
-                <w:rFonts w:ascii="Arial Unicode MS" w:hAnsi="Arial Unicode MS" w:eastAsia="Arial Unicode MS"/>
+                <w:rFonts w:ascii="Aptos" w:hAnsi="Aptos" w:eastAsia="PingFang TC" w:cs="Aptos"/>
                 <w:b w:val="0"/>
                 <w:color w:val="263238"/>
                 <w:sz w:val="17"/>
@@ -2436,7 +2446,7 @@
             <w:r/>
             <w:r>
               <w:rPr>
-                <w:rFonts w:ascii="Calibri" w:hAnsi="Calibri" w:eastAsia="Arial Unicode MS"/>
+                <w:rFonts w:ascii="Aptos" w:hAnsi="Aptos" w:eastAsia="PingFang TC" w:cs="Aptos"/>
                 <w:b/>
                 <w:color w:val="263238"/>
                 <w:sz w:val="17"/>
@@ -2458,7 +2468,7 @@
             <w:r/>
             <w:r>
               <w:rPr>
-                <w:rFonts w:ascii="Arial Unicode MS" w:hAnsi="Arial Unicode MS" w:eastAsia="Arial Unicode MS"/>
+                <w:rFonts w:ascii="Aptos" w:hAnsi="Aptos" w:eastAsia="PingFang TC" w:cs="Aptos"/>
                 <w:b w:val="0"/>
                 <w:color w:val="263238"/>
                 <w:sz w:val="17"/>
@@ -2479,7 +2489,7 @@
             <w:r/>
             <w:r>
               <w:rPr>
-                <w:rFonts w:ascii="Arial Unicode MS" w:hAnsi="Arial Unicode MS" w:eastAsia="Arial Unicode MS"/>
+                <w:rFonts w:ascii="Aptos" w:hAnsi="Aptos" w:eastAsia="PingFang TC" w:cs="Aptos"/>
                 <w:b w:val="0"/>
                 <w:color w:val="263238"/>
                 <w:sz w:val="17"/>
@@ -2506,7 +2516,7 @@
             <w:r/>
             <w:r>
               <w:rPr>
-                <w:rFonts w:ascii="Calibri" w:hAnsi="Calibri" w:eastAsia="Arial Unicode MS"/>
+                <w:rFonts w:ascii="Aptos" w:hAnsi="Aptos" w:eastAsia="PingFang TC" w:cs="Aptos"/>
                 <w:b/>
                 <w:color w:val="263238"/>
                 <w:sz w:val="17"/>
@@ -2529,7 +2539,7 @@
             <w:r/>
             <w:r>
               <w:rPr>
-                <w:rFonts w:ascii="Arial Unicode MS" w:hAnsi="Arial Unicode MS" w:eastAsia="Arial Unicode MS"/>
+                <w:rFonts w:ascii="Aptos" w:hAnsi="Aptos" w:eastAsia="PingFang TC" w:cs="Aptos"/>
                 <w:b w:val="0"/>
                 <w:color w:val="263238"/>
                 <w:sz w:val="17"/>
@@ -2551,7 +2561,7 @@
             <w:r/>
             <w:r>
               <w:rPr>
-                <w:rFonts w:ascii="Arial Unicode MS" w:hAnsi="Arial Unicode MS" w:eastAsia="Arial Unicode MS"/>
+                <w:rFonts w:ascii="Aptos" w:hAnsi="Aptos" w:eastAsia="PingFang TC" w:cs="Aptos"/>
                 <w:b w:val="0"/>
                 <w:color w:val="263238"/>
                 <w:sz w:val="17"/>
@@ -2577,7 +2587,7 @@
             <w:r/>
             <w:r>
               <w:rPr>
-                <w:rFonts w:ascii="Calibri" w:hAnsi="Calibri" w:eastAsia="Arial Unicode MS"/>
+                <w:rFonts w:ascii="Aptos" w:hAnsi="Aptos" w:eastAsia="PingFang TC" w:cs="Aptos"/>
                 <w:b/>
                 <w:color w:val="263238"/>
                 <w:sz w:val="17"/>
@@ -2599,7 +2609,7 @@
             <w:r/>
             <w:r>
               <w:rPr>
-                <w:rFonts w:ascii="Arial Unicode MS" w:hAnsi="Arial Unicode MS" w:eastAsia="Arial Unicode MS"/>
+                <w:rFonts w:ascii="Aptos" w:hAnsi="Aptos" w:eastAsia="PingFang TC" w:cs="Aptos"/>
                 <w:b w:val="0"/>
                 <w:color w:val="263238"/>
                 <w:sz w:val="17"/>
@@ -2620,7 +2630,7 @@
             <w:r/>
             <w:r>
               <w:rPr>
-                <w:rFonts w:ascii="Arial Unicode MS" w:hAnsi="Arial Unicode MS" w:eastAsia="Arial Unicode MS"/>
+                <w:rFonts w:ascii="Aptos" w:hAnsi="Aptos" w:eastAsia="PingFang TC" w:cs="Aptos"/>
                 <w:b w:val="0"/>
                 <w:color w:val="263238"/>
                 <w:sz w:val="17"/>
@@ -2647,7 +2657,7 @@
             <w:r/>
             <w:r>
               <w:rPr>
-                <w:rFonts w:ascii="Calibri" w:hAnsi="Calibri" w:eastAsia="Arial Unicode MS"/>
+                <w:rFonts w:ascii="Aptos" w:hAnsi="Aptos" w:eastAsia="PingFang TC" w:cs="Aptos"/>
                 <w:b/>
                 <w:color w:val="263238"/>
                 <w:sz w:val="17"/>
@@ -2670,7 +2680,7 @@
             <w:r/>
             <w:r>
               <w:rPr>
-                <w:rFonts w:ascii="Arial Unicode MS" w:hAnsi="Arial Unicode MS" w:eastAsia="Arial Unicode MS"/>
+                <w:rFonts w:ascii="Aptos" w:hAnsi="Aptos" w:eastAsia="PingFang TC" w:cs="Aptos"/>
                 <w:b w:val="0"/>
                 <w:color w:val="263238"/>
                 <w:sz w:val="17"/>
@@ -2692,7 +2702,7 @@
             <w:r/>
             <w:r>
               <w:rPr>
-                <w:rFonts w:ascii="Arial Unicode MS" w:hAnsi="Arial Unicode MS" w:eastAsia="Arial Unicode MS"/>
+                <w:rFonts w:ascii="Aptos" w:hAnsi="Aptos" w:eastAsia="PingFang TC" w:cs="Aptos"/>
                 <w:b w:val="0"/>
                 <w:color w:val="263238"/>
                 <w:sz w:val="17"/>
@@ -2718,7 +2728,7 @@
             <w:r/>
             <w:r>
               <w:rPr>
-                <w:rFonts w:ascii="Calibri" w:hAnsi="Calibri" w:eastAsia="Arial Unicode MS"/>
+                <w:rFonts w:ascii="Aptos" w:hAnsi="Aptos" w:eastAsia="PingFang TC" w:cs="Aptos"/>
                 <w:b/>
                 <w:color w:val="263238"/>
                 <w:sz w:val="17"/>
@@ -2740,7 +2750,7 @@
             <w:r/>
             <w:r>
               <w:rPr>
-                <w:rFonts w:ascii="Arial Unicode MS" w:hAnsi="Arial Unicode MS" w:eastAsia="Arial Unicode MS"/>
+                <w:rFonts w:ascii="Aptos" w:hAnsi="Aptos" w:eastAsia="PingFang TC" w:cs="Aptos"/>
                 <w:b w:val="0"/>
                 <w:color w:val="263238"/>
                 <w:sz w:val="17"/>
@@ -2761,7 +2771,7 @@
             <w:r/>
             <w:r>
               <w:rPr>
-                <w:rFonts w:ascii="Arial Unicode MS" w:hAnsi="Arial Unicode MS" w:eastAsia="Arial Unicode MS"/>
+                <w:rFonts w:ascii="Aptos" w:hAnsi="Aptos" w:eastAsia="PingFang TC" w:cs="Aptos"/>
                 <w:b w:val="0"/>
                 <w:color w:val="263238"/>
                 <w:sz w:val="17"/>
@@ -2788,7 +2798,7 @@
             <w:r/>
             <w:r>
               <w:rPr>
-                <w:rFonts w:ascii="Calibri" w:hAnsi="Calibri" w:eastAsia="Arial Unicode MS"/>
+                <w:rFonts w:ascii="Aptos" w:hAnsi="Aptos" w:eastAsia="PingFang TC" w:cs="Aptos"/>
                 <w:b/>
                 <w:color w:val="263238"/>
                 <w:sz w:val="17"/>
@@ -2811,7 +2821,7 @@
             <w:r/>
             <w:r>
               <w:rPr>
-                <w:rFonts w:ascii="Arial Unicode MS" w:hAnsi="Arial Unicode MS" w:eastAsia="Arial Unicode MS"/>
+                <w:rFonts w:ascii="Aptos" w:hAnsi="Aptos" w:eastAsia="PingFang TC" w:cs="Aptos"/>
                 <w:b w:val="0"/>
                 <w:color w:val="263238"/>
                 <w:sz w:val="17"/>
@@ -2833,7 +2843,7 @@
             <w:r/>
             <w:r>
               <w:rPr>
-                <w:rFonts w:ascii="Arial Unicode MS" w:hAnsi="Arial Unicode MS" w:eastAsia="Arial Unicode MS"/>
+                <w:rFonts w:ascii="Aptos" w:hAnsi="Aptos" w:eastAsia="PingFang TC" w:cs="Aptos"/>
                 <w:b w:val="0"/>
                 <w:color w:val="263238"/>
                 <w:sz w:val="17"/>
@@ -2859,7 +2869,7 @@
             <w:r/>
             <w:r>
               <w:rPr>
-                <w:rFonts w:ascii="Calibri" w:hAnsi="Calibri" w:eastAsia="Arial Unicode MS"/>
+                <w:rFonts w:ascii="Aptos" w:hAnsi="Aptos" w:eastAsia="PingFang TC" w:cs="Aptos"/>
                 <w:b/>
                 <w:color w:val="263238"/>
                 <w:sz w:val="17"/>
@@ -2881,7 +2891,7 @@
             <w:r/>
             <w:r>
               <w:rPr>
-                <w:rFonts w:ascii="Arial Unicode MS" w:hAnsi="Arial Unicode MS" w:eastAsia="Arial Unicode MS"/>
+                <w:rFonts w:ascii="Aptos" w:hAnsi="Aptos" w:eastAsia="PingFang TC" w:cs="Aptos"/>
                 <w:b w:val="0"/>
                 <w:color w:val="263238"/>
                 <w:sz w:val="17"/>
@@ -2902,7 +2912,7 @@
             <w:r/>
             <w:r>
               <w:rPr>
-                <w:rFonts w:ascii="Arial Unicode MS" w:hAnsi="Arial Unicode MS" w:eastAsia="Arial Unicode MS"/>
+                <w:rFonts w:ascii="Aptos" w:hAnsi="Aptos" w:eastAsia="PingFang TC" w:cs="Aptos"/>
                 <w:b w:val="0"/>
                 <w:color w:val="263238"/>
                 <w:sz w:val="17"/>
@@ -2927,7 +2937,7 @@
       </w:pPr>
       <w:r>
         <w:rPr>
-          <w:rFonts w:ascii="Arial Unicode MS" w:hAnsi="Arial Unicode MS" w:eastAsia="Arial Unicode MS"/>
+          <w:rFonts w:ascii="Aptos" w:hAnsi="Aptos" w:eastAsia="PingFang TC" w:cs="Aptos"/>
           <w:b/>
           <w:color w:val="183A61"/>
         </w:rPr>
@@ -2935,7 +2945,7 @@
       </w:r>
       <w:r>
         <w:rPr>
-          <w:rFonts w:ascii="Menlo" w:hAnsi="Menlo" w:eastAsia="Arial Unicode MS"/>
+          <w:rFonts w:ascii="Menlo" w:hAnsi="Menlo" w:eastAsia="PingFang TC" w:cs="Menlo"/>
           <w:color w:val="263238"/>
           <w:sz w:val="19"/>
         </w:rPr>
@@ -2948,7 +2958,7 @@
       </w:pPr>
       <w:r>
         <w:rPr>
-          <w:rFonts w:ascii="Arial Unicode MS" w:hAnsi="Arial Unicode MS" w:eastAsia="Arial Unicode MS"/>
+          <w:rFonts w:ascii="Aptos" w:hAnsi="Aptos" w:eastAsia="PingFang TC" w:cs="Aptos"/>
           <w:b/>
           <w:color w:val="183A61"/>
         </w:rPr>
@@ -2956,7 +2966,7 @@
       </w:r>
       <w:r>
         <w:rPr>
-          <w:rFonts w:ascii="Menlo" w:hAnsi="Menlo" w:eastAsia="Arial Unicode MS"/>
+          <w:rFonts w:ascii="Menlo" w:hAnsi="Menlo" w:eastAsia="PingFang TC" w:cs="Menlo"/>
           <w:color w:val="263238"/>
           <w:sz w:val="19"/>
         </w:rPr>
@@ -2969,7 +2979,7 @@
       </w:pPr>
       <w:r>
         <w:rPr>
-          <w:rFonts w:ascii="Calibri" w:hAnsi="Calibri" w:eastAsia="Arial Unicode MS"/>
+          <w:rFonts w:ascii="Aptos" w:hAnsi="Aptos" w:eastAsia="PingFang TC" w:cs="Aptos"/>
           <w:b/>
           <w:color w:val="183A61"/>
         </w:rPr>
@@ -2977,7 +2987,7 @@
       </w:r>
       <w:r>
         <w:rPr>
-          <w:rFonts w:ascii="Menlo" w:hAnsi="Menlo" w:eastAsia="Arial Unicode MS"/>
+          <w:rFonts w:ascii="Menlo" w:hAnsi="Menlo" w:eastAsia="PingFang TC" w:cs="Menlo"/>
           <w:color w:val="263238"/>
           <w:sz w:val="19"/>
         </w:rPr>
@@ -2990,7 +3000,7 @@
       </w:pPr>
       <w:r>
         <w:rPr>
-          <w:rFonts w:ascii="Calibri" w:hAnsi="Calibri" w:eastAsia="Arial Unicode MS"/>
+          <w:rFonts w:ascii="Aptos" w:hAnsi="Aptos" w:eastAsia="PingFang TC" w:cs="Aptos"/>
           <w:b/>
           <w:color w:val="183A61"/>
         </w:rPr>
@@ -2998,7 +3008,7 @@
       </w:r>
       <w:r>
         <w:rPr>
-          <w:rFonts w:ascii="Menlo" w:hAnsi="Menlo" w:eastAsia="Arial Unicode MS"/>
+          <w:rFonts w:ascii="Menlo" w:hAnsi="Menlo" w:eastAsia="PingFang TC" w:cs="Menlo"/>
           <w:color w:val="263238"/>
           <w:sz w:val="19"/>
         </w:rPr>
@@ -3011,7 +3021,7 @@
       </w:pPr>
       <w:r>
         <w:rPr>
-          <w:rFonts w:ascii="Calibri" w:hAnsi="Calibri" w:eastAsia="Arial Unicode MS"/>
+          <w:rFonts w:ascii="Aptos" w:hAnsi="Aptos" w:eastAsia="PingFang TC" w:cs="Aptos"/>
           <w:b/>
           <w:color w:val="183A61"/>
         </w:rPr>
@@ -3019,7 +3029,7 @@
       </w:r>
       <w:r>
         <w:rPr>
-          <w:rFonts w:ascii="Menlo" w:hAnsi="Menlo" w:eastAsia="Arial Unicode MS"/>
+          <w:rFonts w:ascii="Menlo" w:hAnsi="Menlo" w:eastAsia="PingFang TC" w:cs="Menlo"/>
           <w:color w:val="263238"/>
           <w:sz w:val="19"/>
         </w:rPr>
@@ -3032,7 +3042,7 @@
       </w:pPr>
       <w:r>
         <w:rPr>
-          <w:rFonts w:ascii="Arial Unicode MS" w:hAnsi="Arial Unicode MS" w:eastAsia="Arial Unicode MS"/>
+          <w:rFonts w:ascii="Aptos" w:hAnsi="Aptos" w:eastAsia="PingFang TC" w:cs="Aptos"/>
           <w:b/>
           <w:color w:val="183A61"/>
         </w:rPr>
@@ -3040,7 +3050,7 @@
       </w:r>
       <w:r>
         <w:rPr>
-          <w:rFonts w:ascii="Menlo" w:hAnsi="Menlo" w:eastAsia="Arial Unicode MS"/>
+          <w:rFonts w:ascii="Menlo" w:hAnsi="Menlo" w:eastAsia="PingFang TC" w:cs="Menlo"/>
           <w:color w:val="263238"/>
           <w:sz w:val="19"/>
         </w:rPr>
@@ -3059,7 +3069,7 @@
       </w:pPr>
       <w:r>
         <w:rPr>
-          <w:rFonts w:ascii="Arial Unicode MS" w:hAnsi="Arial Unicode MS" w:eastAsia="Arial Unicode MS"/>
+          <w:rFonts w:ascii="Aptos" w:hAnsi="Aptos" w:eastAsia="PingFang TC" w:cs="Aptos"/>
           <w:b/>
           <w:color w:val="183A61"/>
         </w:rPr>
@@ -3067,7 +3077,7 @@
       </w:r>
       <w:r>
         <w:rPr>
-          <w:rFonts w:ascii="Arial Unicode MS" w:hAnsi="Arial Unicode MS" w:eastAsia="Arial Unicode MS"/>
+          <w:rFonts w:ascii="Aptos" w:hAnsi="Aptos" w:eastAsia="PingFang TC" w:cs="Aptos"/>
           <w:color w:val="263238"/>
         </w:rPr>
         <w:t>Slack 與 Telegram 至少要成功建立一個 adapter；若兩者都沒有配置，模組載入時直接失敗。instrumentation.ts 在 Node.js runtime 會 eager import bot，因此配置錯誤可能在應用啟動階段立即暴露。</w:t>
@@ -3092,7 +3102,7 @@
       </w:pPr>
       <w:r>
         <w:rPr>
-          <w:rFonts w:ascii="Arial Unicode MS" w:hAnsi="Arial Unicode MS" w:eastAsia="Arial Unicode MS"/>
+          <w:rFonts w:ascii="Aptos" w:hAnsi="Aptos" w:eastAsia="PingFang TC" w:cs="Aptos"/>
           <w:color w:val="263238"/>
         </w:rPr>
         <w:t>以下不是抽象的最佳實務清單，而是依目前程式樹可以直接觀察到的工程風險與擴充點。</w:t>
@@ -3105,7 +3115,7 @@
       </w:pPr>
       <w:r>
         <w:rPr>
-          <w:rFonts w:ascii="Arial Unicode MS" w:hAnsi="Arial Unicode MS" w:eastAsia="Arial Unicode MS"/>
+          <w:rFonts w:ascii="Aptos" w:hAnsi="Aptos" w:eastAsia="PingFang TC" w:cs="Aptos"/>
           <w:b/>
           <w:color w:val="1F4D78"/>
           <w:sz w:val="22"/>
@@ -3119,7 +3129,7 @@
       </w:pPr>
       <w:r>
         <w:rPr>
-          <w:rFonts w:ascii="Arial Unicode MS" w:hAnsi="Arial Unicode MS" w:eastAsia="Arial Unicode MS"/>
+          <w:rFonts w:ascii="Aptos" w:hAnsi="Aptos" w:eastAsia="PingFang TC" w:cs="Aptos"/>
           <w:color w:val="263238"/>
         </w:rPr>
         <w:t>完成 scheduler、目標 channel／thread 設定、實際發文與 saveDigestThreadContext 呼叫，並讓 instrumentation 註解與實作一致。</w:t>
@@ -3132,7 +3142,7 @@
       </w:pPr>
       <w:r>
         <w:rPr>
-          <w:rFonts w:ascii="Arial Unicode MS" w:hAnsi="Arial Unicode MS" w:eastAsia="Arial Unicode MS"/>
+          <w:rFonts w:ascii="Aptos" w:hAnsi="Aptos" w:eastAsia="PingFang TC" w:cs="Aptos"/>
           <w:b/>
           <w:color w:val="1F4D78"/>
           <w:sz w:val="22"/>
@@ -3146,7 +3156,7 @@
       </w:pPr>
       <w:r>
         <w:rPr>
-          <w:rFonts w:ascii="Arial Unicode MS" w:hAnsi="Arial Unicode MS" w:eastAsia="Arial Unicode MS"/>
+          <w:rFonts w:ascii="Aptos" w:hAnsi="Aptos" w:eastAsia="PingFang TC" w:cs="Aptos"/>
           <w:color w:val="263238"/>
         </w:rPr>
         <w:t>中文或其他語言的研究、資料與 codebase 請求容易落到 chat intent；可加入多語詞彙、輕量分類模型或以模型做低成本 router。</w:t>
@@ -3159,7 +3169,7 @@
       </w:pPr>
       <w:r>
         <w:rPr>
-          <w:rFonts w:ascii="Arial Unicode MS" w:hAnsi="Arial Unicode MS" w:eastAsia="Arial Unicode MS"/>
+          <w:rFonts w:ascii="Aptos" w:hAnsi="Aptos" w:eastAsia="PingFang TC" w:cs="Aptos"/>
           <w:b/>
           <w:color w:val="1F4D78"/>
           <w:sz w:val="22"/>
@@ -3173,7 +3183,7 @@
       </w:pPr>
       <w:r>
         <w:rPr>
-          <w:rFonts w:ascii="Arial Unicode MS" w:hAnsi="Arial Unicode MS" w:eastAsia="Arial Unicode MS"/>
+          <w:rFonts w:ascii="Aptos" w:hAnsi="Aptos" w:eastAsia="PingFang TC" w:cs="Aptos"/>
           <w:color w:val="263238"/>
         </w:rPr>
         <w:t>目前沒有看到測試檔；優先為 planner、allowlist fallback、safe-fetch URL 判斷、Telegram splitting 與 structured upload interception 建立單元測試。</w:t>
@@ -3186,7 +3196,7 @@
       </w:pPr>
       <w:r>
         <w:rPr>
-          <w:rFonts w:ascii="Arial Unicode MS" w:hAnsi="Arial Unicode MS" w:eastAsia="Arial Unicode MS"/>
+          <w:rFonts w:ascii="Aptos" w:hAnsi="Aptos" w:eastAsia="PingFang TC" w:cs="Aptos"/>
           <w:b/>
           <w:color w:val="1F4D78"/>
           <w:sz w:val="22"/>
@@ -3200,7 +3210,7 @@
       </w:pPr>
       <w:r>
         <w:rPr>
-          <w:rFonts w:ascii="Arial Unicode MS" w:hAnsi="Arial Unicode MS" w:eastAsia="Arial Unicode MS"/>
+          <w:rFonts w:ascii="Aptos" w:hAnsi="Aptos" w:eastAsia="PingFang TC" w:cs="Aptos"/>
           <w:color w:val="263238"/>
         </w:rPr>
         <w:t>主 agent 與新聞 curator 使用不同且硬編碼的 model ID；可移到環境設定並加入明確 fallback／成本與延遲策略。</w:t>
@@ -3213,7 +3223,7 @@
       </w:pPr>
       <w:r>
         <w:rPr>
-          <w:rFonts w:ascii="Arial Unicode MS" w:hAnsi="Arial Unicode MS" w:eastAsia="Arial Unicode MS"/>
+          <w:rFonts w:ascii="Aptos" w:hAnsi="Aptos" w:eastAsia="PingFang TC" w:cs="Aptos"/>
           <w:b/>
           <w:color w:val="1F4D78"/>
           <w:sz w:val="22"/>
@@ -3227,7 +3237,7 @@
       </w:pPr>
       <w:r>
         <w:rPr>
-          <w:rFonts w:ascii="Arial Unicode MS" w:hAnsi="Arial Unicode MS" w:eastAsia="Arial Unicode MS"/>
+          <w:rFonts w:ascii="Aptos" w:hAnsi="Aptos" w:eastAsia="PingFang TC" w:cs="Aptos"/>
           <w:color w:val="263238"/>
         </w:rPr>
         <w:t>activeTools 只在前兩 steps 收斂，之後回到完整 toolset；若未來需要真正 permission boundary，應把授權放到工具執行前，而非依賴 planner。</w:t>
@@ -3240,7 +3250,7 @@
       </w:pPr>
       <w:r>
         <w:rPr>
-          <w:rFonts w:ascii="Arial Unicode MS" w:hAnsi="Arial Unicode MS" w:eastAsia="Arial Unicode MS"/>
+          <w:rFonts w:ascii="Aptos" w:hAnsi="Aptos" w:eastAsia="PingFang TC" w:cs="Aptos"/>
           <w:b/>
           <w:color w:val="1F4D78"/>
           <w:sz w:val="22"/>
@@ -3254,7 +3264,7 @@
       </w:pPr>
       <w:r>
         <w:rPr>
-          <w:rFonts w:ascii="Arial Unicode MS" w:hAnsi="Arial Unicode MS" w:eastAsia="Arial Unicode MS"/>
+          <w:rFonts w:ascii="Aptos" w:hAnsi="Aptos" w:eastAsia="PingFang TC" w:cs="Aptos"/>
           <w:color w:val="263238"/>
         </w:rPr>
         <w:t>專案同時有 pnpm-lock.yaml 與 package-lock.json；可確立唯一套件管理流程，避免 CI 與本機解析出不同依賴。</w:t>
@@ -3278,7 +3288,7 @@
       </w:pPr>
       <w:r>
         <w:rPr>
-          <w:rFonts w:ascii="Arial Unicode MS" w:hAnsi="Arial Unicode MS" w:eastAsia="Arial Unicode MS"/>
+          <w:rFonts w:ascii="Aptos" w:hAnsi="Aptos" w:eastAsia="PingFang TC" w:cs="Aptos"/>
           <w:color w:val="263238"/>
         </w:rPr>
         <w:t>先補測試與 configuration validation，建立安全重構的基線。</w:t>
@@ -3294,7 +3304,7 @@
       </w:pPr>
       <w:r>
         <w:rPr>
-          <w:rFonts w:ascii="Arial Unicode MS" w:hAnsi="Arial Unicode MS" w:eastAsia="Arial Unicode MS"/>
+          <w:rFonts w:ascii="Aptos" w:hAnsi="Aptos" w:eastAsia="PingFang TC" w:cs="Aptos"/>
           <w:color w:val="263238"/>
         </w:rPr>
         <w:t>完成新聞 digest 端到端流程，或移除未使用的 cron 依賴與啟動註解，讓產品行為單一且可預期。</w:t>
@@ -3310,7 +3320,7 @@
       </w:pPr>
       <w:r>
         <w:rPr>
-          <w:rFonts w:ascii="Arial Unicode MS" w:hAnsi="Arial Unicode MS" w:eastAsia="Arial Unicode MS"/>
+          <w:rFonts w:ascii="Aptos" w:hAnsi="Aptos" w:eastAsia="PingFang TC" w:cs="Aptos"/>
           <w:color w:val="263238"/>
         </w:rPr>
         <w:t>把 model、history、tool-step 與平台投遞策略集中成 typed configuration。</w:t>
@@ -3326,7 +3336,7 @@
       </w:pPr>
       <w:r>
         <w:rPr>
-          <w:rFonts w:ascii="Arial Unicode MS" w:hAnsi="Arial Unicode MS" w:eastAsia="Arial Unicode MS"/>
+          <w:rFonts w:ascii="Aptos" w:hAnsi="Aptos" w:eastAsia="PingFang TC" w:cs="Aptos"/>
           <w:color w:val="263238"/>
         </w:rPr>
         <w:t>擴充新平台時，只新增 adapter 與少量 platform capabilities；優先維持 handlers、agent 與 tools 不感知平台。</w:t>
@@ -3342,7 +3352,7 @@
       </w:pPr>
       <w:r>
         <w:rPr>
-          <w:rFonts w:ascii="Arial Unicode MS" w:hAnsi="Arial Unicode MS" w:eastAsia="Arial Unicode MS"/>
+          <w:rFonts w:ascii="Aptos" w:hAnsi="Aptos" w:eastAsia="PingFang TC" w:cs="Aptos"/>
           <w:color w:val="263238"/>
         </w:rPr>
         <w:t>若要導入更嚴格權限，新增獨立 authorization layer，根據 tenant／user／tool／side effect 決策並留下 audit event。</w:t>
@@ -3362,7 +3372,7 @@
       </w:pPr>
       <w:r>
         <w:rPr>
-          <w:rFonts w:ascii="Arial Unicode MS" w:hAnsi="Arial Unicode MS" w:eastAsia="Arial Unicode MS"/>
+          <w:rFonts w:ascii="Aptos" w:hAnsi="Aptos" w:eastAsia="PingFang TC" w:cs="Aptos"/>
           <w:b/>
           <w:color w:val="183A61"/>
         </w:rPr>
@@ -3370,7 +3380,7 @@
       </w:r>
       <w:r>
         <w:rPr>
-          <w:rFonts w:ascii="Menlo" w:hAnsi="Menlo" w:eastAsia="Arial Unicode MS"/>
+          <w:rFonts w:ascii="Menlo" w:hAnsi="Menlo" w:eastAsia="PingFang TC" w:cs="Menlo"/>
           <w:color w:val="263238"/>
           <w:sz w:val="18"/>
         </w:rPr>
@@ -3383,7 +3393,7 @@
       </w:pPr>
       <w:r>
         <w:rPr>
-          <w:rFonts w:ascii="Arial Unicode MS" w:hAnsi="Arial Unicode MS" w:eastAsia="Arial Unicode MS"/>
+          <w:rFonts w:ascii="Aptos" w:hAnsi="Aptos" w:eastAsia="PingFang TC" w:cs="Aptos"/>
           <w:b/>
           <w:color w:val="183A61"/>
         </w:rPr>
@@ -3391,7 +3401,7 @@
       </w:r>
       <w:r>
         <w:rPr>
-          <w:rFonts w:ascii="Menlo" w:hAnsi="Menlo" w:eastAsia="Arial Unicode MS"/>
+          <w:rFonts w:ascii="Menlo" w:hAnsi="Menlo" w:eastAsia="PingFang TC" w:cs="Menlo"/>
           <w:color w:val="263238"/>
           <w:sz w:val="18"/>
         </w:rPr>
@@ -3404,7 +3414,7 @@
       </w:pPr>
       <w:r>
         <w:rPr>
-          <w:rFonts w:ascii="Arial Unicode MS" w:hAnsi="Arial Unicode MS" w:eastAsia="Arial Unicode MS"/>
+          <w:rFonts w:ascii="Aptos" w:hAnsi="Aptos" w:eastAsia="PingFang TC" w:cs="Aptos"/>
           <w:b/>
           <w:color w:val="183A61"/>
         </w:rPr>
@@ -3412,7 +3422,7 @@
       </w:r>
       <w:r>
         <w:rPr>
-          <w:rFonts w:ascii="Menlo" w:hAnsi="Menlo" w:eastAsia="Arial Unicode MS"/>
+          <w:rFonts w:ascii="Menlo" w:hAnsi="Menlo" w:eastAsia="PingFang TC" w:cs="Menlo"/>
           <w:color w:val="263238"/>
           <w:sz w:val="18"/>
         </w:rPr>
@@ -3425,7 +3435,7 @@
       </w:pPr>
       <w:r>
         <w:rPr>
-          <w:rFonts w:ascii="Arial Unicode MS" w:hAnsi="Arial Unicode MS" w:eastAsia="Arial Unicode MS"/>
+          <w:rFonts w:ascii="Aptos" w:hAnsi="Aptos" w:eastAsia="PingFang TC" w:cs="Aptos"/>
           <w:b/>
           <w:color w:val="183A61"/>
         </w:rPr>
@@ -3433,7 +3443,7 @@
       </w:r>
       <w:r>
         <w:rPr>
-          <w:rFonts w:ascii="Menlo" w:hAnsi="Menlo" w:eastAsia="Arial Unicode MS"/>
+          <w:rFonts w:ascii="Menlo" w:hAnsi="Menlo" w:eastAsia="PingFang TC" w:cs="Menlo"/>
           <w:color w:val="263238"/>
           <w:sz w:val="18"/>
         </w:rPr>
@@ -3446,7 +3456,7 @@
       </w:pPr>
       <w:r>
         <w:rPr>
-          <w:rFonts w:ascii="Arial Unicode MS" w:hAnsi="Arial Unicode MS" w:eastAsia="Arial Unicode MS"/>
+          <w:rFonts w:ascii="Aptos" w:hAnsi="Aptos" w:eastAsia="PingFang TC" w:cs="Aptos"/>
           <w:b/>
           <w:color w:val="183A61"/>
         </w:rPr>
@@ -3454,7 +3464,7 @@
       </w:r>
       <w:r>
         <w:rPr>
-          <w:rFonts w:ascii="Menlo" w:hAnsi="Menlo" w:eastAsia="Arial Unicode MS"/>
+          <w:rFonts w:ascii="Menlo" w:hAnsi="Menlo" w:eastAsia="PingFang TC" w:cs="Menlo"/>
           <w:color w:val="263238"/>
           <w:sz w:val="18"/>
         </w:rPr>
@@ -3467,7 +3477,7 @@
       </w:pPr>
       <w:r>
         <w:rPr>
-          <w:rFonts w:ascii="Arial Unicode MS" w:hAnsi="Arial Unicode MS" w:eastAsia="Arial Unicode MS"/>
+          <w:rFonts w:ascii="Aptos" w:hAnsi="Aptos" w:eastAsia="PingFang TC" w:cs="Aptos"/>
           <w:b/>
           <w:color w:val="183A61"/>
         </w:rPr>
@@ -3475,7 +3485,7 @@
       </w:r>
       <w:r>
         <w:rPr>
-          <w:rFonts w:ascii="Menlo" w:hAnsi="Menlo" w:eastAsia="Arial Unicode MS"/>
+          <w:rFonts w:ascii="Menlo" w:hAnsi="Menlo" w:eastAsia="PingFang TC" w:cs="Menlo"/>
           <w:color w:val="263238"/>
           <w:sz w:val="18"/>
         </w:rPr>
@@ -3488,7 +3498,7 @@
       </w:pPr>
       <w:r>
         <w:rPr>
-          <w:rFonts w:ascii="Arial Unicode MS" w:hAnsi="Arial Unicode MS" w:eastAsia="Arial Unicode MS"/>
+          <w:rFonts w:ascii="Aptos" w:hAnsi="Aptos" w:eastAsia="PingFang TC" w:cs="Aptos"/>
           <w:b/>
           <w:color w:val="183A61"/>
         </w:rPr>
@@ -3496,7 +3506,7 @@
       </w:r>
       <w:r>
         <w:rPr>
-          <w:rFonts w:ascii="Menlo" w:hAnsi="Menlo" w:eastAsia="Arial Unicode MS"/>
+          <w:rFonts w:ascii="Menlo" w:hAnsi="Menlo" w:eastAsia="PingFang TC" w:cs="Menlo"/>
           <w:color w:val="263238"/>
           <w:sz w:val="18"/>
         </w:rPr>
@@ -3509,7 +3519,7 @@
       </w:pPr>
       <w:r>
         <w:rPr>
-          <w:rFonts w:ascii="Arial Unicode MS" w:hAnsi="Arial Unicode MS" w:eastAsia="Arial Unicode MS"/>
+          <w:rFonts w:ascii="Aptos" w:hAnsi="Aptos" w:eastAsia="PingFang TC" w:cs="Aptos"/>
           <w:b/>
           <w:color w:val="183A61"/>
         </w:rPr>
@@ -3517,7 +3527,7 @@
       </w:r>
       <w:r>
         <w:rPr>
-          <w:rFonts w:ascii="Menlo" w:hAnsi="Menlo" w:eastAsia="Arial Unicode MS"/>
+          <w:rFonts w:ascii="Menlo" w:hAnsi="Menlo" w:eastAsia="PingFang TC" w:cs="Menlo"/>
           <w:color w:val="263238"/>
           <w:sz w:val="18"/>
         </w:rPr>
@@ -3530,7 +3540,7 @@
       </w:pPr>
       <w:r>
         <w:rPr>
-          <w:rFonts w:ascii="Arial Unicode MS" w:hAnsi="Arial Unicode MS" w:eastAsia="Arial Unicode MS"/>
+          <w:rFonts w:ascii="Aptos" w:hAnsi="Aptos" w:eastAsia="PingFang TC" w:cs="Aptos"/>
           <w:b/>
           <w:color w:val="183A61"/>
         </w:rPr>
@@ -3538,7 +3548,7 @@
       </w:r>
       <w:r>
         <w:rPr>
-          <w:rFonts w:ascii="Menlo" w:hAnsi="Menlo" w:eastAsia="Arial Unicode MS"/>
+          <w:rFonts w:ascii="Menlo" w:hAnsi="Menlo" w:eastAsia="PingFang TC" w:cs="Menlo"/>
           <w:color w:val="263238"/>
           <w:sz w:val="18"/>
         </w:rPr>
@@ -3551,7 +3561,7 @@
       </w:pPr>
       <w:r>
         <w:rPr>
-          <w:rFonts w:ascii="Arial Unicode MS" w:hAnsi="Arial Unicode MS" w:eastAsia="Arial Unicode MS"/>
+          <w:rFonts w:ascii="Aptos" w:hAnsi="Aptos" w:eastAsia="PingFang TC" w:cs="Aptos"/>
           <w:b/>
           <w:color w:val="183A61"/>
         </w:rPr>
@@ -3559,7 +3569,7 @@
       </w:r>
       <w:r>
         <w:rPr>
-          <w:rFonts w:ascii="Menlo" w:hAnsi="Menlo" w:eastAsia="Arial Unicode MS"/>
+          <w:rFonts w:ascii="Menlo" w:hAnsi="Menlo" w:eastAsia="PingFang TC" w:cs="Menlo"/>
           <w:color w:val="263238"/>
           <w:sz w:val="18"/>
         </w:rPr>
@@ -3578,7 +3588,7 @@
       </w:pPr>
       <w:r>
         <w:rPr>
-          <w:rFonts w:ascii="Arial Unicode MS" w:hAnsi="Arial Unicode MS" w:eastAsia="Arial Unicode MS"/>
+          <w:rFonts w:ascii="Aptos" w:hAnsi="Aptos" w:eastAsia="PingFang TC" w:cs="Aptos"/>
           <w:b/>
           <w:color w:val="183A61"/>
         </w:rPr>
@@ -3586,7 +3596,7 @@
       </w:r>
       <w:r>
         <w:rPr>
-          <w:rFonts w:ascii="Arial Unicode MS" w:hAnsi="Arial Unicode MS" w:eastAsia="Arial Unicode MS"/>
+          <w:rFonts w:ascii="Aptos" w:hAnsi="Aptos" w:eastAsia="PingFang TC" w:cs="Aptos"/>
           <w:color w:val="263238"/>
         </w:rPr>
         <w:t>本文件依 2026-07-25 工作區程式碼產生。若 README 與實作不一致，以程式碼行為為準；後續架構改動時，建議同步更新本文件與三張來源 SVG。</w:t>
@@ -3616,7 +3626,7 @@
     <w:r/>
     <w:r>
       <w:rPr>
-        <w:rFonts w:ascii="Calibri" w:hAnsi="Calibri" w:eastAsia="Arial Unicode MS"/>
+        <w:rFonts w:ascii="Aptos" w:hAnsi="Aptos" w:eastAsia="PingFang TC" w:cs="Aptos"/>
         <w:color w:val="5E6E79"/>
         <w:sz w:val="17"/>
       </w:rPr>
@@ -3624,7 +3634,7 @@
     </w:r>
     <w:r>
       <w:rPr>
-        <w:rFonts w:ascii="Calibri" w:hAnsi="Calibri" w:eastAsia="Arial Unicode MS"/>
+        <w:rFonts w:ascii="Aptos" w:hAnsi="Aptos" w:eastAsia="PingFang TC" w:cs="Aptos"/>
         <w:color w:val="5E6E79"/>
         <w:sz w:val="17"/>
       </w:rPr>
@@ -3649,7 +3659,7 @@
     <w:r/>
     <w:r>
       <w:rPr>
-        <w:rFonts w:ascii="Calibri" w:hAnsi="Calibri" w:eastAsia="Arial Unicode MS"/>
+        <w:rFonts w:ascii="Aptos" w:hAnsi="Aptos" w:eastAsia="PingFang TC" w:cs="Aptos"/>
         <w:b/>
         <w:color w:val="5E6E79"/>
         <w:sz w:val="17"/>
@@ -4106,7 +4116,7 @@
       <w:spacing w:before="0" w:after="120" w:line="264" w:lineRule="auto"/>
     </w:pPr>
     <w:rPr>
-      <w:rFonts w:ascii="Calibri" w:hAnsi="Calibri" w:eastAsia="Arial Unicode MS"/>
+      <w:rFonts w:ascii="Aptos" w:hAnsi="Aptos" w:eastAsia="PingFang TC"/>
       <w:color w:val="263238"/>
       <w:sz w:val="22"/>
     </w:rPr>
@@ -4170,7 +4180,7 @@
       <w:outlineLvl w:val="0"/>
     </w:pPr>
     <w:rPr>
-      <w:rFonts w:asciiTheme="majorHAnsi" w:eastAsiaTheme="majorEastAsia" w:hAnsiTheme="majorHAnsi" w:cstheme="majorBidi" w:ascii="Arial Unicode MS" w:hAnsi="Arial Unicode MS" w:eastAsia="Arial Unicode MS"/>
+      <w:rFonts w:asciiTheme="majorHAnsi" w:eastAsiaTheme="majorEastAsia" w:hAnsiTheme="majorHAnsi" w:cstheme="majorBidi" w:ascii="Aptos" w:hAnsi="Aptos" w:eastAsia="PingFang TC"/>
       <w:b/>
       <w:bCs/>
       <w:color w:val="2E74B5"/>
@@ -4194,7 +4204,7 @@
       <w:outlineLvl w:val="1"/>
     </w:pPr>
     <w:rPr>
-      <w:rFonts w:asciiTheme="majorHAnsi" w:eastAsiaTheme="majorEastAsia" w:hAnsiTheme="majorHAnsi" w:cstheme="majorBidi" w:ascii="Arial Unicode MS" w:hAnsi="Arial Unicode MS" w:eastAsia="Arial Unicode MS"/>
+      <w:rFonts w:asciiTheme="majorHAnsi" w:eastAsiaTheme="majorEastAsia" w:hAnsiTheme="majorHAnsi" w:cstheme="majorBidi" w:ascii="Aptos" w:hAnsi="Aptos" w:eastAsia="PingFang TC"/>
       <w:b/>
       <w:bCs/>
       <w:color w:val="2E74B5"/>
@@ -4218,7 +4228,7 @@
       <w:outlineLvl w:val="2"/>
     </w:pPr>
     <w:rPr>
-      <w:rFonts w:asciiTheme="majorHAnsi" w:eastAsiaTheme="majorEastAsia" w:hAnsiTheme="majorHAnsi" w:cstheme="majorBidi" w:ascii="Arial Unicode MS" w:hAnsi="Arial Unicode MS" w:eastAsia="Arial Unicode MS"/>
+      <w:rFonts w:asciiTheme="majorHAnsi" w:eastAsiaTheme="majorEastAsia" w:hAnsiTheme="majorHAnsi" w:cstheme="majorBidi" w:ascii="Aptos" w:hAnsi="Aptos" w:eastAsia="PingFang TC"/>
       <w:b/>
       <w:bCs/>
       <w:color w:val="1F4D78"/>

</xml_diff>